<commit_message>
Add UX/UI Reviewer agent and simplify workflows
- Introduce new UX/UI Reviewer agent for visual UI/UX quality assessment with screenshot-based evaluation
- Remove dual-platform build requirement from code-migrator (Windows + Linux builds no longer mandatory)
- Simplify agent output format by removing LESSONS CHECK requirement from CORE.md
- Clean up generated binary files (.docx, .pdf) and project files
</commit_message>
<xml_diff>
--- a/CLAUDE.docx
+++ b/CLAUDE.docx
@@ -454,7 +454,9 @@
         <w:br/>
         <w:t>│   ├── QA Lead  (L3 - Lead)</w:t>
         <w:br/>
-        <w:t>│   │   └── QA Engineer  (L5 - Junior IC)</w:t>
+        <w:t>│   │   ├── QA Engineer  (L5 - Junior IC)</w:t>
+        <w:br/>
+        <w:t>│   │   └── UX/UI Reviewer  (L4 - Senior IC)</w:t>
         <w:br/>
         <w:t>│   ├── DevOps Lead  (L3 - Lead)</w:t>
         <w:br/>
@@ -1657,7 +1659,7 @@
               <w:rPr>
                 <w:sz w:val="20"/>
               </w:rPr>
-              <w:t>Sửa lỗi UI nhỏ, typo, config sai không đụng logic (P3)</w:t>
+              <w:t>Review UI/UX ứng dụng đang chạy (visual check)</w:t>
             </w:r>
           </w:p>
         </w:tc>
@@ -1677,7 +1679,7 @@
               <w:rPr>
                 <w:sz w:val="20"/>
               </w:rPr>
-              <w:t>WF-FASTTRACK</w:t>
+              <w:t>WF-UXREVIEW</w:t>
             </w:r>
           </w:p>
         </w:tc>
@@ -1685,6 +1687,65 @@
           <w:tcPr>
             <w:tcW w:type="dxa" w:w="3230"/>
             <w:shd w:val="clear" w:color="auto" w:fill="B8B3D6"/>
+            <w:tcBorders>
+              <w:top w:val="single" w:sz="4" w:space="0" w:color="CBCBCB"/>
+              <w:left w:val="single" w:sz="4" w:space="0" w:color="CBCBCB"/>
+              <w:bottom w:val="single" w:sz="4" w:space="0" w:color="CBCBCB"/>
+              <w:right w:val="single" w:sz="4" w:space="0" w:color="CBCBCB"/>
+            </w:tcBorders>
+          </w:tcPr>
+          <w:p>
+            <w:r>
+              <w:rPr>
+                <w:sz w:val="20"/>
+              </w:rPr>
+              <w:t>UX-REVIEWER (mở app + screenshot + đánh giá 7 tiêu chí) → QAL (sign-off)</w:t>
+            </w:r>
+          </w:p>
+        </w:tc>
+      </w:tr>
+      <w:tr>
+        <w:tc>
+          <w:tcPr>
+            <w:tcW w:type="dxa" w:w="3230"/>
+            <w:tcBorders>
+              <w:top w:val="single" w:sz="4" w:space="0" w:color="CBCBCB"/>
+              <w:left w:val="single" w:sz="4" w:space="0" w:color="CBCBCB"/>
+              <w:bottom w:val="single" w:sz="4" w:space="0" w:color="CBCBCB"/>
+              <w:right w:val="single" w:sz="4" w:space="0" w:color="CBCBCB"/>
+            </w:tcBorders>
+          </w:tcPr>
+          <w:p>
+            <w:r>
+              <w:rPr>
+                <w:sz w:val="20"/>
+              </w:rPr>
+              <w:t>Sửa lỗi UI nhỏ, typo, config sai không đụng logic (P3)</w:t>
+            </w:r>
+          </w:p>
+        </w:tc>
+        <w:tc>
+          <w:tcPr>
+            <w:tcW w:type="dxa" w:w="3230"/>
+            <w:tcBorders>
+              <w:top w:val="single" w:sz="4" w:space="0" w:color="CBCBCB"/>
+              <w:left w:val="single" w:sz="4" w:space="0" w:color="CBCBCB"/>
+              <w:bottom w:val="single" w:sz="4" w:space="0" w:color="CBCBCB"/>
+              <w:right w:val="single" w:sz="4" w:space="0" w:color="CBCBCB"/>
+            </w:tcBorders>
+          </w:tcPr>
+          <w:p>
+            <w:r>
+              <w:rPr>
+                <w:sz w:val="20"/>
+              </w:rPr>
+              <w:t>WF-FASTTRACK</w:t>
+            </w:r>
+          </w:p>
+        </w:tc>
+        <w:tc>
+          <w:tcPr>
+            <w:tcW w:type="dxa" w:w="3230"/>
             <w:tcBorders>
               <w:top w:val="single" w:sz="4" w:space="0" w:color="CBCBCB"/>
               <w:left w:val="single" w:sz="4" w:space="0" w:color="CBCBCB"/>
@@ -2190,7 +2251,9 @@
         <w:br/>
         <w:t>Bước 14 → DEVOPS LEAD          : Approve staging, verify smoke test</w:t>
         <w:br/>
-        <w:t>Bước 15 → DEVOPS LEAD          : Approve và deploy production, monitor</w:t>
+        <w:t>Bước 15 → UX/UI REVIEWER       : Mở app staging, duyệt toàn bộ màn hình, screenshot + đánh giá 7 tiêu chí, xuất UX-REVIEW report</w:t>
+        <w:br/>
+        <w:t>Bước 16 → DEVOPS LEAD          : Approve và deploy production, monitor</w:t>
       </w:r>
     </w:p>
     <w:p>
@@ -2227,6 +2290,24 @@
           <w:sz w:val="21"/>
         </w:rPr>
         <w:t xml:space="preserve"> Không có task phù hợp cấp Junior, hoặc deadline quá gấp.</w:t>
+      </w:r>
+    </w:p>
+    <w:p>
+      <w:pPr>
+        <w:spacing w:after="80"/>
+      </w:pPr>
+      <w:r>
+        <w:rPr>
+          <w:b/>
+          <w:sz w:val="21"/>
+        </w:rPr>
+        <w:t>Điều kiện bỏ qua Bước 15 (UX/UI Reviewer):</w:t>
+      </w:r>
+      <w:r>
+        <w:rPr>
+          <w:sz w:val="21"/>
+        </w:rPr>
+        <w:t xml:space="preserve"> Feature không có thay đổi UI (backend-only, config, infra).</w:t>
       </w:r>
     </w:p>
     <w:p>
@@ -3833,6 +3914,290 @@
     </w:p>
     <w:p>
       <w:pPr>
+        <w:pStyle w:val="Heading3"/>
+        <w:spacing w:before="160" w:after="60"/>
+      </w:pPr>
+      <w:r>
+        <w:rPr>
+          <w:color w:val="4A3F8C"/>
+          <w:sz w:val="24"/>
+        </w:rPr>
+        <w:t>WF-UXREVIEW — Review UI/UX ứng dụng đang chạy</w:t>
+      </w:r>
+    </w:p>
+    <w:p>
+      <w:pPr>
+        <w:spacing w:after="80"/>
+      </w:pPr>
+      <w:r>
+        <w:rPr>
+          <w:b/>
+          <w:sz w:val="21"/>
+        </w:rPr>
+        <w:t>Trigger:</w:t>
+      </w:r>
+      <w:r>
+        <w:rPr>
+          <w:sz w:val="21"/>
+        </w:rPr>
+        <w:t xml:space="preserve"> User yêu cầu kiểm tra giao diện trực quan — layout, overlap, hiển thị đầy đủ, brand color, responsive.</w:t>
+      </w:r>
+    </w:p>
+    <w:p>
+      <w:pPr>
+        <w:spacing w:before="40" w:after="40"/>
+        <w:ind w:left="567"/>
+        <w:pBdr>
+          <w:left w:val="single" w:sz="12" w:space="10" w:color="F05922"/>
+        </w:pBdr>
+      </w:pPr>
+      <w:r>
+        <w:rPr>
+          <w:color w:val="4A3F8C"/>
+        </w:rPr>
+        <w:t xml:space="preserve">⚠️ </w:t>
+      </w:r>
+      <w:r>
+        <w:rPr>
+          <w:b/>
+          <w:color w:val="4A3F8C"/>
+        </w:rPr>
+        <w:t>CHÚ Ý:</w:t>
+      </w:r>
+      <w:r>
+        <w:rPr>
+          <w:color w:val="4A3F8C"/>
+        </w:rPr>
+        <w:t xml:space="preserve"> Workflow này </w:t>
+      </w:r>
+      <w:r>
+        <w:rPr>
+          <w:b/>
+          <w:color w:val="4A3F8C"/>
+        </w:rPr>
+        <w:t>KHÔNG thay thế</w:t>
+      </w:r>
+      <w:r>
+        <w:rPr>
+          <w:color w:val="4A3F8C"/>
+        </w:rPr>
+        <w:t xml:space="preserve"> functional testing (đó là WF-BUGFIX / QA Engineer). Chỉ tập trung vào chất lượng </w:t>
+      </w:r>
+      <w:r>
+        <w:rPr>
+          <w:b/>
+          <w:color w:val="4A3F8C"/>
+        </w:rPr>
+        <w:t>hiển thị và trải nghiệm thị giác</w:t>
+      </w:r>
+      <w:r>
+        <w:rPr>
+          <w:color w:val="4A3F8C"/>
+        </w:rPr>
+        <w:t>.</w:t>
+      </w:r>
+    </w:p>
+    <w:p>
+      <w:pPr>
+        <w:spacing w:before="80" w:after="80"/>
+        <w:ind w:left="283"/>
+        <w:shd w:val="clear" w:color="auto" w:fill="F4F4F8"/>
+      </w:pPr>
+      <w:r>
+        <w:rPr>
+          <w:rFonts w:ascii="Courier New" w:hAnsi="Courier New"/>
+          <w:color w:val="251C53"/>
+          <w:sz w:val="18"/>
+        </w:rPr>
+        <w:t>Bước 1 → UX/UI REVIEWER : Khởi động app → liệt kê tất cả màn hình/module</w:t>
+        <w:br/>
+        <w:t>Bước 2 → UX/UI REVIEWER : Duyệt từng màn hình: screenshot + đánh giá 7 tiêu chí (C1–C7)</w:t>
+        <w:br/>
+        <w:t>Bước 3 → UX/UI REVIEWER : Test responsive (nhiều kích thước cửa sổ)</w:t>
+        <w:br/>
+        <w:t>Bước 4 → UX/UI REVIEWER : Viết UX-REVIEW report, phân loại issue (Critical/High/Medium/Low)</w:t>
+        <w:br/>
+        <w:t>Bước 5 → QA LEAD        : Review report, xác nhận issue Critical trước khi sign-off</w:t>
+      </w:r>
+    </w:p>
+    <w:p>
+      <w:pPr>
+        <w:spacing w:after="80"/>
+      </w:pPr>
+      <w:r>
+        <w:rPr>
+          <w:b/>
+          <w:sz w:val="21"/>
+        </w:rPr>
+        <w:t>7 tiêu chí đánh giá (C1–C7):</w:t>
+      </w:r>
+      <w:r>
+        <w:rPr>
+          <w:sz w:val="21"/>
+        </w:rPr>
+        <w:t xml:space="preserve"> Layout hợp lý · Không chồng chéo · Hiển thị đầy đủ · Typography nhất quán · Màu sắc đúng brand KZTEK · Trạng thái đặc biệt (loading/empty/error) · Khoảng cách &amp; alignment.</w:t>
+      </w:r>
+    </w:p>
+    <w:p>
+      <w:pPr>
+        <w:spacing w:after="80"/>
+      </w:pPr>
+      <w:r>
+        <w:rPr>
+          <w:b/>
+          <w:sz w:val="21"/>
+        </w:rPr>
+        <w:t>Điều kiện bắt buộc trước khi bắt đầu:</w:t>
+      </w:r>
+    </w:p>
+    <w:p>
+      <w:pPr>
+        <w:pStyle w:val="ListBullet"/>
+        <w:spacing w:after="20"/>
+        <w:ind w:left="283"/>
+      </w:pPr>
+      <w:r>
+        <w:rPr>
+          <w:sz w:val="21"/>
+        </w:rPr>
+        <w:t>App phải đang chạy (local / staging) — UX Reviewer KHÔNG tự deploy.</w:t>
+      </w:r>
+    </w:p>
+    <w:p>
+      <w:pPr>
+        <w:pStyle w:val="ListBullet"/>
+        <w:spacing w:after="20"/>
+        <w:ind w:left="283"/>
+      </w:pPr>
+      <w:r>
+        <w:rPr>
+          <w:sz w:val="21"/>
+        </w:rPr>
+        <w:t>Nếu app chưa chạy → BLOCK, yêu cầu DevOps Engineer khởi động trước.</w:t>
+      </w:r>
+    </w:p>
+    <w:p>
+      <w:pPr>
+        <w:spacing w:after="80"/>
+      </w:pPr>
+      <w:r>
+        <w:rPr>
+          <w:b/>
+          <w:sz w:val="21"/>
+        </w:rPr>
+        <w:t>Output bắt buộc:</w:t>
+      </w:r>
+    </w:p>
+    <w:p>
+      <w:pPr>
+        <w:pStyle w:val="ListBullet"/>
+        <w:spacing w:after="20"/>
+        <w:ind w:left="283"/>
+      </w:pPr>
+      <w:r>
+        <w:rPr>
+          <w:rFonts w:ascii="Courier New" w:hAnsi="Courier New"/>
+          <w:color w:val="F05922"/>
+          <w:sz w:val="21"/>
+        </w:rPr>
+        <w:t>docs/ux-review/screenshots/[YYYY-MM-DD]/*.png</w:t>
+      </w:r>
+      <w:r>
+        <w:rPr>
+          <w:sz w:val="21"/>
+        </w:rPr>
+        <w:t xml:space="preserve"> — Screenshot từng màn hình</w:t>
+      </w:r>
+    </w:p>
+    <w:p>
+      <w:pPr>
+        <w:pStyle w:val="ListBullet"/>
+        <w:spacing w:after="20"/>
+        <w:ind w:left="283"/>
+      </w:pPr>
+      <w:r>
+        <w:rPr>
+          <w:rFonts w:ascii="Courier New" w:hAnsi="Courier New"/>
+          <w:color w:val="F05922"/>
+          <w:sz w:val="21"/>
+        </w:rPr>
+        <w:t>docs/ux-review/UX-REVIEW-[YYYY-MM-DD].md</w:t>
+      </w:r>
+      <w:r>
+        <w:rPr>
+          <w:sz w:val="21"/>
+        </w:rPr>
+        <w:t xml:space="preserve"> — Report đầy đủ</w:t>
+      </w:r>
+    </w:p>
+    <w:p>
+      <w:pPr>
+        <w:pStyle w:val="ListBullet"/>
+        <w:spacing w:after="20"/>
+        <w:ind w:left="283"/>
+      </w:pPr>
+      <w:r>
+        <w:rPr>
+          <w:rFonts w:ascii="Courier New" w:hAnsi="Courier New"/>
+          <w:color w:val="F05922"/>
+          <w:sz w:val="21"/>
+        </w:rPr>
+        <w:t>docs/ux-review/UX-REVIEW-[YYYY-MM-DD].docx</w:t>
+      </w:r>
+      <w:r>
+        <w:rPr>
+          <w:sz w:val="21"/>
+        </w:rPr>
+        <w:t xml:space="preserve"> — Xuất bởi </w:t>
+      </w:r>
+      <w:r>
+        <w:rPr>
+          <w:rFonts w:ascii="Courier New" w:hAnsi="Courier New"/>
+          <w:color w:val="F05922"/>
+          <w:sz w:val="21"/>
+        </w:rPr>
+        <w:t>md_to_docx_kztek.py</w:t>
+      </w:r>
+    </w:p>
+    <w:p>
+      <w:pPr>
+        <w:pStyle w:val="ListBullet"/>
+        <w:spacing w:after="20"/>
+        <w:ind w:left="283"/>
+      </w:pPr>
+      <w:r>
+        <w:rPr>
+          <w:rFonts w:ascii="Courier New" w:hAnsi="Courier New"/>
+          <w:color w:val="F05922"/>
+          <w:sz w:val="21"/>
+        </w:rPr>
+        <w:t>docs/ux-review/UX-REVIEW-[YYYY-MM-DD].pdf</w:t>
+      </w:r>
+      <w:r>
+        <w:rPr>
+          <w:sz w:val="21"/>
+        </w:rPr>
+        <w:t xml:space="preserve"> — Xuất bởi </w:t>
+      </w:r>
+      <w:r>
+        <w:rPr>
+          <w:rFonts w:ascii="Courier New" w:hAnsi="Courier New"/>
+          <w:color w:val="F05922"/>
+          <w:sz w:val="21"/>
+        </w:rPr>
+        <w:t>md_to_docx_kztek.py</w:t>
+      </w:r>
+    </w:p>
+    <w:p>
+      <w:pPr>
+        <w:pBdr>
+          <w:bottom w:val="single" w:sz="6" w:space="1" w:color="F05922"/>
+        </w:pBdr>
+        <w:spacing w:after="120"/>
+      </w:pPr>
+    </w:p>
+    <w:p>
+      <w:pPr>
         <w:pStyle w:val="Heading2"/>
         <w:spacing w:before="200" w:after="80"/>
       </w:pPr>
@@ -5082,7 +5447,7 @@
               <w:rPr>
                 <w:sz w:val="20"/>
               </w:rPr>
-              <w:t>Deploy staging</w:t>
+              <w:t>UX Review report</w:t>
             </w:r>
           </w:p>
         </w:tc>
@@ -5101,7 +5466,7 @@
               <w:rPr>
                 <w:sz w:val="20"/>
               </w:rPr>
-              <w:t>DevOps Engineer</w:t>
+              <w:t>UX/UI Reviewer</w:t>
             </w:r>
           </w:p>
         </w:tc>
@@ -5120,7 +5485,7 @@
               <w:rPr>
                 <w:sz w:val="20"/>
               </w:rPr>
-              <w:t>DevOps Lead</w:t>
+              <w:t>QA Lead</w:t>
             </w:r>
           </w:p>
         </w:tc>
@@ -5142,7 +5507,7 @@
               <w:rPr>
                 <w:sz w:val="20"/>
               </w:rPr>
-              <w:t>Deploy production</w:t>
+              <w:t>Deploy staging</w:t>
             </w:r>
           </w:p>
         </w:tc>
@@ -5170,6 +5535,65 @@
           <w:tcPr>
             <w:tcW w:type="dxa" w:w="3230"/>
             <w:shd w:val="clear" w:color="auto" w:fill="B8B3D6"/>
+            <w:tcBorders>
+              <w:top w:val="single" w:sz="4" w:space="0" w:color="CBCBCB"/>
+              <w:left w:val="single" w:sz="4" w:space="0" w:color="CBCBCB"/>
+              <w:bottom w:val="single" w:sz="4" w:space="0" w:color="CBCBCB"/>
+              <w:right w:val="single" w:sz="4" w:space="0" w:color="CBCBCB"/>
+            </w:tcBorders>
+          </w:tcPr>
+          <w:p>
+            <w:r>
+              <w:rPr>
+                <w:sz w:val="20"/>
+              </w:rPr>
+              <w:t>DevOps Lead</w:t>
+            </w:r>
+          </w:p>
+        </w:tc>
+      </w:tr>
+      <w:tr>
+        <w:tc>
+          <w:tcPr>
+            <w:tcW w:type="dxa" w:w="3230"/>
+            <w:tcBorders>
+              <w:top w:val="single" w:sz="4" w:space="0" w:color="CBCBCB"/>
+              <w:left w:val="single" w:sz="4" w:space="0" w:color="CBCBCB"/>
+              <w:bottom w:val="single" w:sz="4" w:space="0" w:color="CBCBCB"/>
+              <w:right w:val="single" w:sz="4" w:space="0" w:color="CBCBCB"/>
+            </w:tcBorders>
+          </w:tcPr>
+          <w:p>
+            <w:r>
+              <w:rPr>
+                <w:sz w:val="20"/>
+              </w:rPr>
+              <w:t>Deploy production</w:t>
+            </w:r>
+          </w:p>
+        </w:tc>
+        <w:tc>
+          <w:tcPr>
+            <w:tcW w:type="dxa" w:w="3230"/>
+            <w:tcBorders>
+              <w:top w:val="single" w:sz="4" w:space="0" w:color="CBCBCB"/>
+              <w:left w:val="single" w:sz="4" w:space="0" w:color="CBCBCB"/>
+              <w:bottom w:val="single" w:sz="4" w:space="0" w:color="CBCBCB"/>
+              <w:right w:val="single" w:sz="4" w:space="0" w:color="CBCBCB"/>
+            </w:tcBorders>
+          </w:tcPr>
+          <w:p>
+            <w:r>
+              <w:rPr>
+                <w:sz w:val="20"/>
+              </w:rPr>
+              <w:t>DevOps Engineer</w:t>
+            </w:r>
+          </w:p>
+        </w:tc>
+        <w:tc>
+          <w:tcPr>
+            <w:tcW w:type="dxa" w:w="3230"/>
             <w:tcBorders>
               <w:top w:val="single" w:sz="4" w:space="0" w:color="CBCBCB"/>
               <w:left w:val="single" w:sz="4" w:space="0" w:color="CBCBCB"/>
@@ -5502,6 +5926,8 @@
         <w:br/>
         <w:t>├── bugs/                   ← QA Engineer</w:t>
         <w:br/>
+        <w:t>├── ux-review/              ← UX/UI Reviewer</w:t>
+        <w:br/>
         <w:t>├── incidents/              ← DevOps Lead</w:t>
         <w:br/>
         <w:t>└── devops/                 ← DevOps Lead + DevOps Engineer</w:t>
@@ -6565,6 +6991,171 @@
                 <w:sz w:val="20"/>
               </w:rPr>
               <w:t>, checklist điền đủ</w:t>
+            </w:r>
+          </w:p>
+        </w:tc>
+      </w:tr>
+      <w:tr>
+        <w:tc>
+          <w:tcPr>
+            <w:tcW w:type="dxa" w:w="3230"/>
+            <w:tcBorders>
+              <w:top w:val="single" w:sz="4" w:space="0" w:color="CBCBCB"/>
+              <w:left w:val="single" w:sz="4" w:space="0" w:color="CBCBCB"/>
+              <w:bottom w:val="single" w:sz="4" w:space="0" w:color="CBCBCB"/>
+              <w:right w:val="single" w:sz="4" w:space="0" w:color="CBCBCB"/>
+            </w:tcBorders>
+          </w:tcPr>
+          <w:p>
+            <w:r>
+              <w:rPr>
+                <w:sz w:val="20"/>
+              </w:rPr>
+              <w:t>WF-FEATURE / WF-UXREVIEW</w:t>
+            </w:r>
+          </w:p>
+        </w:tc>
+        <w:tc>
+          <w:tcPr>
+            <w:tcW w:type="dxa" w:w="3230"/>
+            <w:tcBorders>
+              <w:top w:val="single" w:sz="4" w:space="0" w:color="CBCBCB"/>
+              <w:left w:val="single" w:sz="4" w:space="0" w:color="CBCBCB"/>
+              <w:bottom w:val="single" w:sz="4" w:space="0" w:color="CBCBCB"/>
+              <w:right w:val="single" w:sz="4" w:space="0" w:color="CBCBCB"/>
+            </w:tcBorders>
+          </w:tcPr>
+          <w:p>
+            <w:r>
+              <w:rPr>
+                <w:sz w:val="20"/>
+              </w:rPr>
+              <w:t>UX/UI Reviewer</w:t>
+            </w:r>
+          </w:p>
+        </w:tc>
+        <w:tc>
+          <w:tcPr>
+            <w:tcW w:type="dxa" w:w="3230"/>
+            <w:tcBorders>
+              <w:top w:val="single" w:sz="4" w:space="0" w:color="CBCBCB"/>
+              <w:left w:val="single" w:sz="4" w:space="0" w:color="CBCBCB"/>
+              <w:bottom w:val="single" w:sz="4" w:space="0" w:color="CBCBCB"/>
+              <w:right w:val="single" w:sz="4" w:space="0" w:color="CBCBCB"/>
+            </w:tcBorders>
+          </w:tcPr>
+          <w:p>
+            <w:r>
+              <w:rPr>
+                <w:rFonts w:ascii="Courier New" w:hAnsi="Courier New"/>
+                <w:color w:val="F05922"/>
+                <w:sz w:val="20"/>
+              </w:rPr>
+              <w:t>docs/ux-review/UX-REVIEW-*.md</w:t>
+            </w:r>
+            <w:r>
+              <w:rPr>
+                <w:sz w:val="20"/>
+              </w:rPr>
+              <w:t xml:space="preserve"> + </w:t>
+            </w:r>
+            <w:r>
+              <w:rPr>
+                <w:rFonts w:ascii="Courier New" w:hAnsi="Courier New"/>
+                <w:color w:val="F05922"/>
+                <w:sz w:val="20"/>
+              </w:rPr>
+              <w:t>*.docx</w:t>
+            </w:r>
+            <w:r>
+              <w:rPr>
+                <w:sz w:val="20"/>
+              </w:rPr>
+              <w:t xml:space="preserve"> + </w:t>
+            </w:r>
+            <w:r>
+              <w:rPr>
+                <w:rFonts w:ascii="Courier New" w:hAnsi="Courier New"/>
+                <w:color w:val="F05922"/>
+                <w:sz w:val="20"/>
+              </w:rPr>
+              <w:t>*.pdf</w:t>
+            </w:r>
+            <w:r>
+              <w:rPr>
+                <w:sz w:val="20"/>
+              </w:rPr>
+              <w:t xml:space="preserve"> + </w:t>
+            </w:r>
+            <w:r>
+              <w:rPr>
+                <w:rFonts w:ascii="Courier New" w:hAnsi="Courier New"/>
+                <w:color w:val="F05922"/>
+                <w:sz w:val="20"/>
+              </w:rPr>
+              <w:t>screenshots/</w:t>
+            </w:r>
+          </w:p>
+        </w:tc>
+      </w:tr>
+      <w:tr>
+        <w:tc>
+          <w:tcPr>
+            <w:tcW w:type="dxa" w:w="3230"/>
+            <w:shd w:val="clear" w:color="auto" w:fill="B8B3D6"/>
+            <w:tcBorders>
+              <w:top w:val="single" w:sz="4" w:space="0" w:color="CBCBCB"/>
+              <w:left w:val="single" w:sz="4" w:space="0" w:color="CBCBCB"/>
+              <w:bottom w:val="single" w:sz="4" w:space="0" w:color="CBCBCB"/>
+              <w:right w:val="single" w:sz="4" w:space="0" w:color="CBCBCB"/>
+            </w:tcBorders>
+          </w:tcPr>
+          <w:p>
+            <w:r>
+              <w:rPr>
+                <w:sz w:val="20"/>
+              </w:rPr>
+              <w:t>WF-UXREVIEW</w:t>
+            </w:r>
+          </w:p>
+        </w:tc>
+        <w:tc>
+          <w:tcPr>
+            <w:tcW w:type="dxa" w:w="3230"/>
+            <w:shd w:val="clear" w:color="auto" w:fill="B8B3D6"/>
+            <w:tcBorders>
+              <w:top w:val="single" w:sz="4" w:space="0" w:color="CBCBCB"/>
+              <w:left w:val="single" w:sz="4" w:space="0" w:color="CBCBCB"/>
+              <w:bottom w:val="single" w:sz="4" w:space="0" w:color="CBCBCB"/>
+              <w:right w:val="single" w:sz="4" w:space="0" w:color="CBCBCB"/>
+            </w:tcBorders>
+          </w:tcPr>
+          <w:p>
+            <w:r>
+              <w:rPr>
+                <w:sz w:val="20"/>
+              </w:rPr>
+              <w:t>QA Lead</w:t>
+            </w:r>
+          </w:p>
+        </w:tc>
+        <w:tc>
+          <w:tcPr>
+            <w:tcW w:type="dxa" w:w="3230"/>
+            <w:shd w:val="clear" w:color="auto" w:fill="B8B3D6"/>
+            <w:tcBorders>
+              <w:top w:val="single" w:sz="4" w:space="0" w:color="CBCBCB"/>
+              <w:left w:val="single" w:sz="4" w:space="0" w:color="CBCBCB"/>
+              <w:bottom w:val="single" w:sz="4" w:space="0" w:color="CBCBCB"/>
+              <w:right w:val="single" w:sz="4" w:space="0" w:color="CBCBCB"/>
+            </w:tcBorders>
+          </w:tcPr>
+          <w:p>
+            <w:r>
+              <w:rPr>
+                <w:sz w:val="20"/>
+              </w:rPr>
+              <w:t>Sign-off nhúng trong UX-REVIEW report</w:t>
             </w:r>
           </w:p>
         </w:tc>
@@ -8420,7 +9011,7 @@
                 <w:b/>
                 <w:sz w:val="20"/>
               </w:rPr>
-              <w:t>Documentation Writer</w:t>
+              <w:t>UX/UI Reviewer</w:t>
             </w:r>
           </w:p>
         </w:tc>
@@ -8448,6 +9039,71 @@
         <w:tc>
           <w:tcPr>
             <w:tcW w:type="dxa" w:w="3230"/>
+            <w:tcBorders>
+              <w:top w:val="single" w:sz="4" w:space="0" w:color="CBCBCB"/>
+              <w:left w:val="single" w:sz="4" w:space="0" w:color="CBCBCB"/>
+              <w:bottom w:val="single" w:sz="4" w:space="0" w:color="CBCBCB"/>
+              <w:right w:val="single" w:sz="4" w:space="0" w:color="CBCBCB"/>
+            </w:tcBorders>
+          </w:tcPr>
+          <w:p>
+            <w:r>
+              <w:rPr>
+                <w:sz w:val="20"/>
+              </w:rPr>
+              <w:t>Đánh giá giao diện trực quan, phân tích screenshot, viết review report</w:t>
+            </w:r>
+          </w:p>
+        </w:tc>
+      </w:tr>
+      <w:tr>
+        <w:tc>
+          <w:tcPr>
+            <w:tcW w:type="dxa" w:w="3230"/>
+            <w:shd w:val="clear" w:color="auto" w:fill="B8B3D6"/>
+            <w:tcBorders>
+              <w:top w:val="single" w:sz="4" w:space="0" w:color="CBCBCB"/>
+              <w:left w:val="single" w:sz="4" w:space="0" w:color="CBCBCB"/>
+              <w:bottom w:val="single" w:sz="4" w:space="0" w:color="CBCBCB"/>
+              <w:right w:val="single" w:sz="4" w:space="0" w:color="CBCBCB"/>
+            </w:tcBorders>
+          </w:tcPr>
+          <w:p>
+            <w:r>
+              <w:rPr>
+                <w:b/>
+                <w:sz w:val="20"/>
+              </w:rPr>
+              <w:t>Documentation Writer</w:t>
+            </w:r>
+          </w:p>
+        </w:tc>
+        <w:tc>
+          <w:tcPr>
+            <w:tcW w:type="dxa" w:w="3230"/>
+            <w:shd w:val="clear" w:color="auto" w:fill="B8B3D6"/>
+            <w:tcBorders>
+              <w:top w:val="single" w:sz="4" w:space="0" w:color="CBCBCB"/>
+              <w:left w:val="single" w:sz="4" w:space="0" w:color="CBCBCB"/>
+              <w:bottom w:val="single" w:sz="4" w:space="0" w:color="CBCBCB"/>
+              <w:right w:val="single" w:sz="4" w:space="0" w:color="CBCBCB"/>
+            </w:tcBorders>
+          </w:tcPr>
+          <w:p>
+            <w:r>
+              <w:rPr>
+                <w:rFonts w:ascii="Courier New" w:hAnsi="Courier New"/>
+                <w:color w:val="F05922"/>
+                <w:sz w:val="20"/>
+              </w:rPr>
+              <w:t>claude-sonnet-4-6</w:t>
+            </w:r>
+          </w:p>
+        </w:tc>
+        <w:tc>
+          <w:tcPr>
+            <w:tcW w:type="dxa" w:w="3230"/>
+            <w:shd w:val="clear" w:color="auto" w:fill="B8B3D6"/>
             <w:tcBorders>
               <w:top w:val="single" w:sz="4" w:space="0" w:color="CBCBCB"/>
               <w:left w:val="single" w:sz="4" w:space="0" w:color="CBCBCB"/>

</xml_diff>

<commit_message>
[PLAN-optimize-framework] Bước 3.1: Làm rõ trạng thái docs/* trong CLAUDE.md §11
- Thêm ghi chú tường minh ngay sau "Cấu trúc thư mục chuẩn" trong §11
- Xác nhận thực tế: chỉ docs/research/ tồn tại, mọi docs/prd/ docs/user-stories/ v.v. KHÔNG tồn tại
- CORE.md không có mục tương đương — không cần sửa
- Xuất CLAUDE.docx đồng bộ theo §19

Plan: .claude/plans/PLAN-optimize-framework-2026-07-12.md
</commit_message>
<xml_diff>
--- a/CLAUDE.docx
+++ b/CLAUDE.docx
@@ -85,6 +85,8 @@
           <w:sz w:val="18"/>
         </w:rPr>
         <w:t>Read: .claude/shared/CORE.md</w:t>
+        <w:br/>
+        <w:t>Read: .claude/GOTCHAS.md</w:t>
       </w:r>
     </w:p>
     <w:p>
@@ -123,6 +125,38 @@
           <w:sz w:val="21"/>
         </w:rPr>
         <w:t xml:space="preserve"> Không cần đọc lại trong cùng session.</w:t>
+      </w:r>
+    </w:p>
+    <w:p>
+      <w:pPr>
+        <w:spacing w:after="80"/>
+      </w:pPr>
+      <w:r>
+        <w:rPr>
+          <w:sz w:val="21"/>
+        </w:rPr>
+        <w:t xml:space="preserve">File </w:t>
+      </w:r>
+      <w:r>
+        <w:rPr>
+          <w:rFonts w:ascii="Courier New" w:hAnsi="Courier New"/>
+          <w:color w:val="F05922"/>
+          <w:sz w:val="18"/>
+        </w:rPr>
+        <w:t>GOTCHAS.md</w:t>
+      </w:r>
+      <w:r>
+        <w:rPr>
+          <w:sz w:val="21"/>
+        </w:rPr>
+        <w:t xml:space="preserve"> ghi lại các lỗi ngầm đã gặp — đọc khi bắt đầu session để tránh lặp lại các lỗi đã biết. </w:t>
+      </w:r>
+      <w:r>
+        <w:rPr>
+          <w:b/>
+          <w:sz w:val="21"/>
+        </w:rPr>
+        <w:t>Mọi agent fix xong 1 lỗi ngầm (không có trong docs chính thức) PHẢI thêm 1 entry vào `.claude/GOTCHAS.md` trước khi đánh dấu task hoàn thành.</w:t>
       </w:r>
     </w:p>
     <w:p>
@@ -2935,6 +2969,8 @@
         <w:br/>
         <w:t>Bước 10 → TECH LEAD            : Code review cuối, merge decision</w:t>
         <w:br/>
+        <w:t xml:space="preserve">  &gt; **Yêu cầu trước Bước 10:** Senior/Junior Developer PHẢI chạy `/verify-pr` và đính kèm VERIFICATION REPORT vào PR description. Tech Lead chỉ mở review khi report toàn PASS. (`.claude/commands/verify-pr.md`)</w:t>
+        <w:br/>
         <w:t>Bước 10a → TECH LEAD           : [CÓ ĐIỀU KIỆN — nếu đụng auth/payment/DB schema/dữ liệu nhạy cảm] Chạy skill `security-audit-stride` (OWASP + STRIDE), BLOCK merge nếu Fail nhóm rủi ro cao</w:t>
         <w:br/>
         <w:t>Bước 10b ∥ Bước 11 (song song — cả hai cùng nhận code đã merge từ Bước 10/10a, độc lập nhau):</w:t>
@@ -3080,6 +3116,8 @@
         <w:t>Bước 2 → SENIOR DEVELOPER         : Viết fix, tạo PR với mô tả rõ</w:t>
         <w:br/>
         <w:t>Bước 3 → TECH LEAD                : Review PR, approve hoặc request changes</w:t>
+        <w:br/>
+        <w:t xml:space="preserve">  &gt; **Yêu cầu trước Bước 3:** Senior Developer PHẢI chạy `/verify-pr` và đính kèm VERIFICATION REPORT vào PR description. Tech Lead chỉ review khi report toàn PASS. (`.claude/commands/verify-pr.md`)</w:t>
         <w:br/>
         <w:t>Bước 3b → UX/UI REVIEWER          : [CÓ ĐIỀU KIỆN — nếu fix có đổi giao diện] Chạy app thật, kiểm tra trực quan trước khi QA verify</w:t>
         <w:br/>
@@ -6604,6 +6642,629 @@
           <w:sz w:val="21"/>
         </w:rPr>
         <w:t xml:space="preserve"> — Product Manager không viết code; Tech Lead không quyết định scope sản phẩm.</w:t>
+      </w:r>
+    </w:p>
+    <w:p>
+      <w:pPr>
+        <w:pBdr>
+          <w:bottom w:val="single" w:sz="6" w:space="1" w:color="F05922"/>
+        </w:pBdr>
+        <w:spacing w:after="120"/>
+      </w:pPr>
+    </w:p>
+    <w:p>
+      <w:pPr>
+        <w:pStyle w:val="Heading2"/>
+        <w:spacing w:before="200" w:after="80"/>
+      </w:pPr>
+      <w:r>
+        <w:rPr>
+          <w:color w:val="F05922"/>
+          <w:sz w:val="28"/>
+        </w:rPr>
+        <w:t>9a. Xử lý Agent bị Stuck / Loop — Agent Introspection Debugging</w:t>
+      </w:r>
+    </w:p>
+    <w:p>
+      <w:pPr>
+        <w:spacing w:before="40" w:after="40"/>
+        <w:ind w:left="567"/>
+        <w:pBdr>
+          <w:left w:val="single" w:sz="12" w:space="10" w:color="F05922"/>
+        </w:pBdr>
+      </w:pPr>
+      <w:r>
+        <w:rPr>
+          <w:b/>
+          <w:color w:val="4A3F8C"/>
+        </w:rPr>
+        <w:t>Nguồn gốc:</w:t>
+      </w:r>
+      <w:r>
+        <w:rPr>
+          <w:color w:val="4A3F8C"/>
+        </w:rPr>
+        <w:t xml:space="preserve"> Học từ </w:t>
+      </w:r>
+      <w:r>
+        <w:rPr>
+          <w:rFonts w:ascii="Courier New" w:hAnsi="Courier New"/>
+          <w:color w:val="F05922"/>
+          <w:sz w:val="18"/>
+        </w:rPr>
+        <w:t>agent-introspection-debugging</w:t>
+      </w:r>
+      <w:r>
+        <w:rPr>
+          <w:color w:val="4A3F8C"/>
+        </w:rPr>
+        <w:t xml:space="preserve"> skill của affaan-m/ecc. Khi agent gặp lỗi lặp lại mà không có tiến triển, thay vì retry mù quáng, áp dụng quy trình 4-phase dưới đây.</w:t>
+      </w:r>
+    </w:p>
+    <w:p>
+      <w:pPr>
+        <w:spacing w:after="80"/>
+      </w:pPr>
+      <w:r>
+        <w:rPr>
+          <w:b/>
+          <w:sz w:val="21"/>
+        </w:rPr>
+        <w:t>Định nghĩa "loop":</w:t>
+      </w:r>
+      <w:r>
+        <w:rPr>
+          <w:sz w:val="21"/>
+        </w:rPr>
+        <w:t xml:space="preserve"> Agent gọi lại cùng 1 tool với input giống/tương tự </w:t>
+      </w:r>
+      <w:r>
+        <w:rPr>
+          <w:b/>
+          <w:sz w:val="21"/>
+        </w:rPr>
+        <w:t>≥ 3 lần liên tiếp</w:t>
+      </w:r>
+      <w:r>
+        <w:rPr>
+          <w:sz w:val="21"/>
+        </w:rPr>
+        <w:t xml:space="preserve"> mà không có tiến triển (output không thay đổi, lỗi không giảm). Phát hiện loop → DỪNG NGAY, thực hiện 4-phase dưới đây.</w:t>
+      </w:r>
+    </w:p>
+    <w:p>
+      <w:pPr>
+        <w:pStyle w:val="Heading3"/>
+        <w:spacing w:before="160" w:after="60"/>
+      </w:pPr>
+      <w:r>
+        <w:rPr>
+          <w:color w:val="4A3F8C"/>
+          <w:sz w:val="24"/>
+        </w:rPr>
+        <w:t>Phase 1 — Capture (Ghi lại trạng thái)</w:t>
+      </w:r>
+    </w:p>
+    <w:p>
+      <w:pPr>
+        <w:spacing w:after="80"/>
+      </w:pPr>
+      <w:r>
+        <w:rPr>
+          <w:sz w:val="21"/>
+        </w:rPr>
+        <w:t>Dừng retry, ghi lại:</w:t>
+      </w:r>
+    </w:p>
+    <w:p>
+      <w:pPr>
+        <w:pStyle w:val="ListBullet"/>
+        <w:spacing w:after="20"/>
+        <w:ind w:left="283"/>
+      </w:pPr>
+      <w:r>
+        <w:rPr>
+          <w:sz w:val="21"/>
+        </w:rPr>
+        <w:t>Lỗi chính xác (message, exit code, traceback nếu có)</w:t>
+      </w:r>
+    </w:p>
+    <w:p>
+      <w:pPr>
+        <w:pStyle w:val="ListBullet"/>
+        <w:spacing w:after="20"/>
+        <w:ind w:left="283"/>
+      </w:pPr>
+      <w:r>
+        <w:rPr>
+          <w:sz w:val="21"/>
+        </w:rPr>
+        <w:t>Tool call cuối cùng (tool name + input)</w:t>
+      </w:r>
+    </w:p>
+    <w:p>
+      <w:pPr>
+        <w:pStyle w:val="ListBullet"/>
+        <w:spacing w:after="20"/>
+        <w:ind w:left="283"/>
+      </w:pPr>
+      <w:r>
+        <w:rPr>
+          <w:sz w:val="21"/>
+        </w:rPr>
+        <w:t>Nguyên nhân nghi ngờ (context pressure? dependency thiếu? path sai?)</w:t>
+      </w:r>
+    </w:p>
+    <w:p>
+      <w:pPr>
+        <w:pStyle w:val="ListBullet"/>
+        <w:spacing w:after="20"/>
+        <w:ind w:left="283"/>
+      </w:pPr>
+      <w:r>
+        <w:rPr>
+          <w:sz w:val="21"/>
+        </w:rPr>
+        <w:t>Số lần đã retry (để xác nhận đây là loop)</w:t>
+      </w:r>
+    </w:p>
+    <w:p>
+      <w:pPr>
+        <w:pStyle w:val="Heading3"/>
+        <w:spacing w:before="160" w:after="60"/>
+      </w:pPr>
+      <w:r>
+        <w:rPr>
+          <w:color w:val="4A3F8C"/>
+          <w:sz w:val="24"/>
+        </w:rPr>
+        <w:t>Phase 2 — Diagnose (Đối chiếu pattern đã biết)</w:t>
+      </w:r>
+    </w:p>
+    <w:p>
+      <w:pPr>
+        <w:spacing w:after="80"/>
+      </w:pPr>
+      <w:r>
+        <w:rPr>
+          <w:sz w:val="21"/>
+        </w:rPr>
+        <w:t>Tra cứu theo thứ tự:</w:t>
+      </w:r>
+    </w:p>
+    <w:p>
+      <w:pPr>
+        <w:spacing w:after="20"/>
+        <w:ind w:left="567" w:hanging="283"/>
+      </w:pPr>
+      <w:r>
+        <w:rPr>
+          <w:sz w:val="21"/>
+        </w:rPr>
+        <w:t>1.</w:t>
+        <w:tab/>
+      </w:r>
+      <w:r>
+        <w:rPr>
+          <w:rFonts w:ascii="Courier New" w:hAnsi="Courier New"/>
+          <w:color w:val="F05922"/>
+          <w:sz w:val="21"/>
+        </w:rPr>
+        <w:t>.claude/GOTCHAS.md</w:t>
+      </w:r>
+      <w:r>
+        <w:rPr>
+          <w:sz w:val="21"/>
+        </w:rPr>
+        <w:t xml:space="preserve"> — lỗi này có trong danh sách lỗi ngầm đã biết không?</w:t>
+      </w:r>
+    </w:p>
+    <w:p>
+      <w:pPr>
+        <w:spacing w:after="20"/>
+        <w:ind w:left="567" w:hanging="283"/>
+      </w:pPr>
+      <w:r>
+        <w:rPr>
+          <w:sz w:val="21"/>
+        </w:rPr>
+        <w:t>2.</w:t>
+        <w:tab/>
+      </w:r>
+      <w:r>
+        <w:rPr>
+          <w:sz w:val="21"/>
+        </w:rPr>
+        <w:t>Đối chiếu pattern phổ biến:</w:t>
+      </w:r>
+    </w:p>
+    <w:p>
+      <w:pPr>
+        <w:pStyle w:val="ListBullet"/>
+        <w:spacing w:after="20"/>
+        <w:ind w:left="567"/>
+      </w:pPr>
+      <w:r>
+        <w:rPr>
+          <w:rFonts w:ascii="Courier New" w:hAnsi="Courier New"/>
+          <w:color w:val="F05922"/>
+          <w:sz w:val="21"/>
+        </w:rPr>
+        <w:t>ModuleNotFoundError</w:t>
+      </w:r>
+      <w:r>
+        <w:rPr>
+          <w:sz w:val="21"/>
+        </w:rPr>
+        <w:t xml:space="preserve"> / </w:t>
+      </w:r>
+      <w:r>
+        <w:rPr>
+          <w:rFonts w:ascii="Courier New" w:hAnsi="Courier New"/>
+          <w:color w:val="F05922"/>
+          <w:sz w:val="21"/>
+        </w:rPr>
+        <w:t>ImportError</w:t>
+      </w:r>
+      <w:r>
+        <w:rPr>
+          <w:sz w:val="21"/>
+        </w:rPr>
+        <w:t xml:space="preserve"> → thiếu dependency → chạy </w:t>
+      </w:r>
+      <w:r>
+        <w:rPr>
+          <w:rFonts w:ascii="Courier New" w:hAnsi="Courier New"/>
+          <w:color w:val="F05922"/>
+          <w:sz w:val="21"/>
+        </w:rPr>
+        <w:t>pip install</w:t>
+      </w:r>
+      <w:r>
+        <w:rPr>
+          <w:sz w:val="21"/>
+        </w:rPr>
+        <w:t xml:space="preserve"> / </w:t>
+      </w:r>
+      <w:r>
+        <w:rPr>
+          <w:rFonts w:ascii="Courier New" w:hAnsi="Courier New"/>
+          <w:color w:val="F05922"/>
+          <w:sz w:val="21"/>
+        </w:rPr>
+        <w:t>npm install</w:t>
+      </w:r>
+    </w:p>
+    <w:p>
+      <w:pPr>
+        <w:pStyle w:val="ListBullet"/>
+        <w:spacing w:after="20"/>
+        <w:ind w:left="567"/>
+      </w:pPr>
+      <w:r>
+        <w:rPr>
+          <w:rFonts w:ascii="Courier New" w:hAnsi="Courier New"/>
+          <w:color w:val="F05922"/>
+          <w:sz w:val="21"/>
+        </w:rPr>
+        <w:t>FileNotFoundError</w:t>
+      </w:r>
+      <w:r>
+        <w:rPr>
+          <w:sz w:val="21"/>
+        </w:rPr>
+        <w:t xml:space="preserve"> / </w:t>
+      </w:r>
+      <w:r>
+        <w:rPr>
+          <w:rFonts w:ascii="Courier New" w:hAnsi="Courier New"/>
+          <w:color w:val="F05922"/>
+          <w:sz w:val="21"/>
+        </w:rPr>
+        <w:t>ENOENT</w:t>
+      </w:r>
+      <w:r>
+        <w:rPr>
+          <w:sz w:val="21"/>
+        </w:rPr>
+        <w:t xml:space="preserve"> → path sai → kiểm tra lại đường dẫn tuyệt đối</w:t>
+      </w:r>
+    </w:p>
+    <w:p>
+      <w:pPr>
+        <w:pStyle w:val="ListBullet"/>
+        <w:spacing w:after="20"/>
+        <w:ind w:left="567"/>
+      </w:pPr>
+      <w:r>
+        <w:rPr>
+          <w:sz w:val="21"/>
+        </w:rPr>
+        <w:t>Build fail liên tục → sai syntax, thiếu file, hoặc version incompatibility</w:t>
+      </w:r>
+    </w:p>
+    <w:p>
+      <w:pPr>
+        <w:pStyle w:val="ListBullet"/>
+        <w:spacing w:after="20"/>
+        <w:ind w:left="567"/>
+      </w:pPr>
+      <w:r>
+        <w:rPr>
+          <w:sz w:val="21"/>
+        </w:rPr>
+        <w:t>Hook exit code 2 → file bảo vệ → KHÔNG tự ý tắt hook, đọc thông báo lỗi của hook</w:t>
+      </w:r>
+    </w:p>
+    <w:p>
+      <w:pPr>
+        <w:pStyle w:val="ListBullet"/>
+        <w:spacing w:after="20"/>
+        <w:ind w:left="567"/>
+      </w:pPr>
+      <w:r>
+        <w:rPr>
+          <w:sz w:val="21"/>
+        </w:rPr>
+        <w:t>Tool timeout → tác vụ quá lớn → chia nhỏ task</w:t>
+      </w:r>
+    </w:p>
+    <w:p>
+      <w:pPr>
+        <w:spacing w:after="20"/>
+        <w:ind w:left="567" w:hanging="283"/>
+      </w:pPr>
+      <w:r>
+        <w:rPr>
+          <w:sz w:val="21"/>
+        </w:rPr>
+        <w:t>3.</w:t>
+        <w:tab/>
+      </w:r>
+      <w:r>
+        <w:rPr>
+          <w:sz w:val="21"/>
+        </w:rPr>
+        <w:t>Nếu không khớp pattern nào → đây là lỗi mới → chuẩn bị ghi vào GOTCHAS.md sau khi fix</w:t>
+      </w:r>
+    </w:p>
+    <w:p>
+      <w:pPr>
+        <w:pStyle w:val="Heading3"/>
+        <w:spacing w:before="160" w:after="60"/>
+      </w:pPr>
+      <w:r>
+        <w:rPr>
+          <w:color w:val="4A3F8C"/>
+          <w:sz w:val="24"/>
+        </w:rPr>
+        <w:t>Phase 3 — Contained Recovery (Hành động nhỏ, có thể rollback)</w:t>
+      </w:r>
+    </w:p>
+    <w:p>
+      <w:pPr>
+        <w:pStyle w:val="ListBullet"/>
+        <w:spacing w:after="20"/>
+        <w:ind w:left="283"/>
+      </w:pPr>
+      <w:r>
+        <w:rPr>
+          <w:sz w:val="21"/>
+        </w:rPr>
+        <w:t xml:space="preserve">Thử </w:t>
+      </w:r>
+      <w:r>
+        <w:rPr>
+          <w:b/>
+          <w:sz w:val="21"/>
+        </w:rPr>
+        <w:t>1 hành động nhỏ nhất</w:t>
+      </w:r>
+      <w:r>
+        <w:rPr>
+          <w:sz w:val="21"/>
+        </w:rPr>
+        <w:t xml:space="preserve"> có thể giải quyết vấn đề (không làm nhiều việc cùng lúc)</w:t>
+      </w:r>
+    </w:p>
+    <w:p>
+      <w:pPr>
+        <w:pStyle w:val="ListBullet"/>
+        <w:spacing w:after="20"/>
+        <w:ind w:left="283"/>
+      </w:pPr>
+      <w:r>
+        <w:rPr>
+          <w:sz w:val="21"/>
+        </w:rPr>
+        <w:t>Hành động PHẢI có thể rollback nếu sai (không xóa file, không sửa config bảo vệ)</w:t>
+      </w:r>
+    </w:p>
+    <w:p>
+      <w:pPr>
+        <w:pStyle w:val="ListBullet"/>
+        <w:spacing w:after="20"/>
+        <w:ind w:left="283"/>
+      </w:pPr>
+      <w:r>
+        <w:rPr>
+          <w:sz w:val="21"/>
+        </w:rPr>
+        <w:t>Kiểm tra kết quả ngay sau 1 lần thử — nếu vẫn fail → chuyển Phase 4, KHÔNG retry thêm</w:t>
+      </w:r>
+    </w:p>
+    <w:p>
+      <w:pPr>
+        <w:spacing w:after="80"/>
+      </w:pPr>
+      <w:r>
+        <w:rPr>
+          <w:sz w:val="21"/>
+        </w:rPr>
+        <w:t>Ví dụ hành động nhỏ hợp lệ:</w:t>
+      </w:r>
+    </w:p>
+    <w:p>
+      <w:pPr>
+        <w:pStyle w:val="ListBullet"/>
+        <w:spacing w:after="20"/>
+        <w:ind w:left="283"/>
+      </w:pPr>
+      <w:r>
+        <w:rPr>
+          <w:sz w:val="21"/>
+        </w:rPr>
+        <w:t>Cài 1 package còn thiếu</w:t>
+      </w:r>
+    </w:p>
+    <w:p>
+      <w:pPr>
+        <w:pStyle w:val="ListBullet"/>
+        <w:spacing w:after="20"/>
+        <w:ind w:left="283"/>
+      </w:pPr>
+      <w:r>
+        <w:rPr>
+          <w:sz w:val="21"/>
+        </w:rPr>
+        <w:t xml:space="preserve">Kiểm tra lại path bằng </w:t>
+      </w:r>
+      <w:r>
+        <w:rPr>
+          <w:rFonts w:ascii="Courier New" w:hAnsi="Courier New"/>
+          <w:color w:val="F05922"/>
+          <w:sz w:val="21"/>
+        </w:rPr>
+        <w:t>ls</w:t>
+      </w:r>
+      <w:r>
+        <w:rPr>
+          <w:sz w:val="21"/>
+        </w:rPr>
+        <w:t xml:space="preserve"> / </w:t>
+      </w:r>
+      <w:r>
+        <w:rPr>
+          <w:rFonts w:ascii="Courier New" w:hAnsi="Courier New"/>
+          <w:color w:val="F05922"/>
+          <w:sz w:val="21"/>
+        </w:rPr>
+        <w:t>Glob</w:t>
+      </w:r>
+    </w:p>
+    <w:p>
+      <w:pPr>
+        <w:pStyle w:val="ListBullet"/>
+        <w:spacing w:after="20"/>
+        <w:ind w:left="283"/>
+      </w:pPr>
+      <w:r>
+        <w:rPr>
+          <w:sz w:val="21"/>
+        </w:rPr>
+        <w:t>Đọc lại file config để xác nhận giá trị thực tế</w:t>
+      </w:r>
+    </w:p>
+    <w:p>
+      <w:pPr>
+        <w:pStyle w:val="Heading3"/>
+        <w:spacing w:before="160" w:after="60"/>
+      </w:pPr>
+      <w:r>
+        <w:rPr>
+          <w:color w:val="4A3F8C"/>
+          <w:sz w:val="24"/>
+        </w:rPr>
+        <w:t>Phase 4 — Report (Báo cáo user, không tự retry thêm)</w:t>
+      </w:r>
+    </w:p>
+    <w:p>
+      <w:pPr>
+        <w:spacing w:after="80"/>
+      </w:pPr>
+      <w:r>
+        <w:rPr>
+          <w:sz w:val="21"/>
+        </w:rPr>
+        <w:t>Hiển thị theo format BLOCK chuẩn (§6) với thông tin đủ để user hoặc agent cấp cao hơn can thiệp:</w:t>
+      </w:r>
+    </w:p>
+    <w:p>
+      <w:pPr>
+        <w:spacing w:before="80" w:after="80"/>
+        <w:ind w:left="283"/>
+        <w:shd w:val="clear" w:color="auto" w:fill="F4F4F8"/>
+      </w:pPr>
+      <w:r>
+        <w:rPr>
+          <w:rFonts w:ascii="Courier New" w:hAnsi="Courier New"/>
+          <w:color w:val="251C53"/>
+          <w:sz w:val="18"/>
+        </w:rPr>
+        <w:t>╔══════════════════════════════════════════════════════════╗</w:t>
+        <w:br/>
+        <w:t>║  🔁 [TÊN AGENT] — LOOP DETECTED / STUCK                 ║</w:t>
+        <w:br/>
+        <w:t>╠══════════════════════════════════════════════════════════╣</w:t>
+        <w:br/>
+        <w:t>║  Tool bị loop  : [tool name + input tóm tắt]            ║</w:t>
+        <w:br/>
+        <w:t>║  Số lần retry  : [N lần]                                ║</w:t>
+        <w:br/>
+        <w:t>║  Lỗi chính xác : [message / exit code]                  ║</w:t>
+        <w:br/>
+        <w:t>║  Nguyên nhân nghi ngờ: [diagnosis từ Phase 2]            ║</w:t>
+        <w:br/>
+        <w:t>║  Đã thử        : [hành động Phase 3, kết quả]           ║</w:t>
+        <w:br/>
+        <w:t>║  Cần từ        : [User / Tech Lead / DevOps]             ║</w:t>
+        <w:br/>
+        <w:t>║  Gợi ý xử lý  : [đề xuất cụ thể cho người can thiệp]   ║</w:t>
+        <w:br/>
+        <w:t>╚══════════════════════════════════════════════════════════╝</w:t>
+      </w:r>
+    </w:p>
+    <w:p>
+      <w:pPr>
+        <w:spacing w:after="80"/>
+      </w:pPr>
+      <w:r>
+        <w:rPr>
+          <w:sz w:val="21"/>
+        </w:rPr>
+        <w:t>Sau khi báo cáo: DỪNG. KHÔNG tự retry. KHÔNG im lặng tiếp tục. Chờ user hoặc cấp trên phản hồi.</w:t>
+      </w:r>
+    </w:p>
+    <w:p>
+      <w:pPr>
+        <w:spacing w:after="80"/>
+      </w:pPr>
+      <w:r>
+        <w:rPr>
+          <w:b/>
+          <w:sz w:val="21"/>
+        </w:rPr>
+        <w:t>Sau khi vấn đề được giải quyết:</w:t>
+      </w:r>
+      <w:r>
+        <w:rPr>
+          <w:sz w:val="21"/>
+        </w:rPr>
+        <w:t xml:space="preserve"> Nếu đây là lỗi ngầm chưa có trong GOTCHAS.md → thêm entry G00N mới vào </w:t>
+      </w:r>
+      <w:r>
+        <w:rPr>
+          <w:rFonts w:ascii="Courier New" w:hAnsi="Courier New"/>
+          <w:color w:val="F05922"/>
+          <w:sz w:val="18"/>
+        </w:rPr>
+        <w:t>.claude/GOTCHAS.md</w:t>
+      </w:r>
+      <w:r>
+        <w:rPr>
+          <w:sz w:val="21"/>
+        </w:rPr>
+        <w:t xml:space="preserve"> trước khi đóng task.</w:t>
       </w:r>
     </w:p>
     <w:p>
@@ -7541,6 +8202,304 @@
       </w:pPr>
       <w:r>
         <w:rPr>
+          <w:b/>
+          <w:color w:val="4A3F8C"/>
+        </w:rPr>
+        <w:t>Lưu ý về trạng thái thực tế (cập nhật 2026-07-12):</w:t>
+      </w:r>
+      <w:r>
+        <w:rPr>
+          <w:color w:val="4A3F8C"/>
+        </w:rPr>
+        <w:t xml:space="preserve"> Cấu trúc trên là </w:t>
+      </w:r>
+      <w:r>
+        <w:rPr>
+          <w:b/>
+          <w:color w:val="4A3F8C"/>
+        </w:rPr>
+        <w:t>QUY ƯỚC đặt tên/vị trí</w:t>
+      </w:r>
+      <w:r>
+        <w:rPr>
+          <w:color w:val="4A3F8C"/>
+        </w:rPr>
+        <w:t xml:space="preserve"> — các thư mục được tạo mới khi bắt đầu một dự án sản phẩm thực tế (ví dụ khi chạy WF-FEATURE lần đầu). Tại thời điểm này, workspace </w:t>
+      </w:r>
+      <w:r>
+        <w:rPr>
+          <w:b/>
+          <w:color w:val="4A3F8C"/>
+        </w:rPr>
+        <w:t>chưa có dự án sản phẩm nào đang phát triển</w:t>
+      </w:r>
+      <w:r>
+        <w:rPr>
+          <w:color w:val="4A3F8C"/>
+        </w:rPr>
+        <w:t>, nên hầu hết các thư mục trên (</w:t>
+      </w:r>
+      <w:r>
+        <w:rPr>
+          <w:rFonts w:ascii="Courier New" w:hAnsi="Courier New"/>
+          <w:color w:val="F05922"/>
+          <w:sz w:val="18"/>
+        </w:rPr>
+        <w:t>docs/prd/</w:t>
+      </w:r>
+      <w:r>
+        <w:rPr>
+          <w:color w:val="4A3F8C"/>
+        </w:rPr>
+        <w:t xml:space="preserve">, </w:t>
+      </w:r>
+      <w:r>
+        <w:rPr>
+          <w:rFonts w:ascii="Courier New" w:hAnsi="Courier New"/>
+          <w:color w:val="F05922"/>
+          <w:sz w:val="18"/>
+        </w:rPr>
+        <w:t>docs/user-stories/</w:t>
+      </w:r>
+      <w:r>
+        <w:rPr>
+          <w:color w:val="4A3F8C"/>
+        </w:rPr>
+        <w:t xml:space="preserve">, </w:t>
+      </w:r>
+      <w:r>
+        <w:rPr>
+          <w:rFonts w:ascii="Courier New" w:hAnsi="Courier New"/>
+          <w:color w:val="F05922"/>
+          <w:sz w:val="18"/>
+        </w:rPr>
+        <w:t>docs/design/</w:t>
+      </w:r>
+      <w:r>
+        <w:rPr>
+          <w:color w:val="4A3F8C"/>
+        </w:rPr>
+        <w:t xml:space="preserve">, </w:t>
+      </w:r>
+      <w:r>
+        <w:rPr>
+          <w:rFonts w:ascii="Courier New" w:hAnsi="Courier New"/>
+          <w:color w:val="F05922"/>
+          <w:sz w:val="18"/>
+        </w:rPr>
+        <w:t>docs/planning/</w:t>
+      </w:r>
+      <w:r>
+        <w:rPr>
+          <w:color w:val="4A3F8C"/>
+        </w:rPr>
+        <w:t xml:space="preserve">, </w:t>
+      </w:r>
+      <w:r>
+        <w:rPr>
+          <w:rFonts w:ascii="Courier New" w:hAnsi="Courier New"/>
+          <w:color w:val="F05922"/>
+          <w:sz w:val="18"/>
+        </w:rPr>
+        <w:t>docs/architecture/</w:t>
+      </w:r>
+      <w:r>
+        <w:rPr>
+          <w:color w:val="4A3F8C"/>
+        </w:rPr>
+        <w:t xml:space="preserve">, </w:t>
+      </w:r>
+      <w:r>
+        <w:rPr>
+          <w:rFonts w:ascii="Courier New" w:hAnsi="Courier New"/>
+          <w:color w:val="F05922"/>
+          <w:sz w:val="18"/>
+        </w:rPr>
+        <w:t>docs/tech-design/</w:t>
+      </w:r>
+      <w:r>
+        <w:rPr>
+          <w:color w:val="4A3F8C"/>
+        </w:rPr>
+        <w:t xml:space="preserve">, </w:t>
+      </w:r>
+      <w:r>
+        <w:rPr>
+          <w:rFonts w:ascii="Courier New" w:hAnsi="Courier New"/>
+          <w:color w:val="F05922"/>
+          <w:sz w:val="18"/>
+        </w:rPr>
+        <w:t>docs/test-plans/</w:t>
+      </w:r>
+      <w:r>
+        <w:rPr>
+          <w:color w:val="4A3F8C"/>
+        </w:rPr>
+        <w:t xml:space="preserve">, </w:t>
+      </w:r>
+      <w:r>
+        <w:rPr>
+          <w:rFonts w:ascii="Courier New" w:hAnsi="Courier New"/>
+          <w:color w:val="F05922"/>
+          <w:sz w:val="18"/>
+        </w:rPr>
+        <w:t>docs/test-cases/</w:t>
+      </w:r>
+      <w:r>
+        <w:rPr>
+          <w:color w:val="4A3F8C"/>
+        </w:rPr>
+        <w:t xml:space="preserve">, </w:t>
+      </w:r>
+      <w:r>
+        <w:rPr>
+          <w:rFonts w:ascii="Courier New" w:hAnsi="Courier New"/>
+          <w:color w:val="F05922"/>
+          <w:sz w:val="18"/>
+        </w:rPr>
+        <w:t>docs/bugs/</w:t>
+      </w:r>
+      <w:r>
+        <w:rPr>
+          <w:color w:val="4A3F8C"/>
+        </w:rPr>
+        <w:t xml:space="preserve">, </w:t>
+      </w:r>
+      <w:r>
+        <w:rPr>
+          <w:rFonts w:ascii="Courier New" w:hAnsi="Courier New"/>
+          <w:color w:val="F05922"/>
+          <w:sz w:val="18"/>
+        </w:rPr>
+        <w:t>docs/incidents/</w:t>
+      </w:r>
+      <w:r>
+        <w:rPr>
+          <w:color w:val="4A3F8C"/>
+        </w:rPr>
+        <w:t xml:space="preserve">, </w:t>
+      </w:r>
+      <w:r>
+        <w:rPr>
+          <w:rFonts w:ascii="Courier New" w:hAnsi="Courier New"/>
+          <w:color w:val="F05922"/>
+          <w:sz w:val="18"/>
+        </w:rPr>
+        <w:t>docs/devops/</w:t>
+      </w:r>
+      <w:r>
+        <w:rPr>
+          <w:color w:val="4A3F8C"/>
+        </w:rPr>
+        <w:t xml:space="preserve">, </w:t>
+      </w:r>
+      <w:r>
+        <w:rPr>
+          <w:rFonts w:ascii="Courier New" w:hAnsi="Courier New"/>
+          <w:color w:val="F05922"/>
+          <w:sz w:val="18"/>
+        </w:rPr>
+        <w:t>infra/</w:t>
+      </w:r>
+      <w:r>
+        <w:rPr>
+          <w:color w:val="4A3F8C"/>
+        </w:rPr>
+        <w:t xml:space="preserve">, </w:t>
+      </w:r>
+      <w:r>
+        <w:rPr>
+          <w:rFonts w:ascii="Courier New" w:hAnsi="Courier New"/>
+          <w:color w:val="F05922"/>
+          <w:sz w:val="18"/>
+        </w:rPr>
+        <w:t>src/</w:t>
+      </w:r>
+      <w:r>
+        <w:rPr>
+          <w:color w:val="4A3F8C"/>
+        </w:rPr>
+        <w:t xml:space="preserve">, </w:t>
+      </w:r>
+      <w:r>
+        <w:rPr>
+          <w:rFonts w:ascii="Courier New" w:hAnsi="Courier New"/>
+          <w:color w:val="F05922"/>
+          <w:sz w:val="18"/>
+        </w:rPr>
+        <w:t>tests/</w:t>
+      </w:r>
+      <w:r>
+        <w:rPr>
+          <w:color w:val="4A3F8C"/>
+        </w:rPr>
+        <w:t xml:space="preserve">) </w:t>
+      </w:r>
+      <w:r>
+        <w:rPr>
+          <w:b/>
+          <w:color w:val="4A3F8C"/>
+        </w:rPr>
+        <w:t>KHÔNG TỒN TẠI</w:t>
+      </w:r>
+      <w:r>
+        <w:rPr>
+          <w:color w:val="4A3F8C"/>
+        </w:rPr>
+        <w:t xml:space="preserve"> trên disk. Chỉ </w:t>
+      </w:r>
+      <w:r>
+        <w:rPr>
+          <w:rFonts w:ascii="Courier New" w:hAnsi="Courier New"/>
+          <w:color w:val="F05922"/>
+          <w:sz w:val="18"/>
+        </w:rPr>
+        <w:t>docs/research/</w:t>
+      </w:r>
+      <w:r>
+        <w:rPr>
+          <w:color w:val="4A3F8C"/>
+        </w:rPr>
+        <w:t xml:space="preserve"> (báo cáo nghiên cứu GitHub repo ngoài) hiện có nội dung. Agent </w:t>
+      </w:r>
+      <w:r>
+        <w:rPr>
+          <w:b/>
+          <w:color w:val="4A3F8C"/>
+        </w:rPr>
+        <w:t>PHẢI dùng Glob/Read để kiểm tra thực tế</w:t>
+      </w:r>
+      <w:r>
+        <w:rPr>
+          <w:color w:val="4A3F8C"/>
+        </w:rPr>
+        <w:t xml:space="preserve"> trước khi giả định bất kỳ artifact nào đã tồn tại trong </w:t>
+      </w:r>
+      <w:r>
+        <w:rPr>
+          <w:rFonts w:ascii="Courier New" w:hAnsi="Courier New"/>
+          <w:color w:val="F05922"/>
+          <w:sz w:val="18"/>
+        </w:rPr>
+        <w:t>docs/</w:t>
+      </w:r>
+      <w:r>
+        <w:rPr>
+          <w:color w:val="4A3F8C"/>
+        </w:rPr>
+        <w:t>.</w:t>
+      </w:r>
+    </w:p>
+    <w:p>
+      <w:pPr>
+        <w:spacing w:before="40" w:after="40"/>
+        <w:ind w:left="567"/>
+        <w:pBdr>
+          <w:left w:val="single" w:sz="12" w:space="10" w:color="F05922"/>
+        </w:pBdr>
+      </w:pPr>
+      <w:r>
+        <w:rPr>
           <w:color w:val="4A3F8C"/>
         </w:rPr>
         <w:t xml:space="preserve">Chi tiết artifact bắt buộc của từng agent: xem file tương ứng trong </w:t>
@@ -16477,6 +17436,197 @@
           <w:sz w:val="21"/>
         </w:rPr>
         <w:t>User yêu cầu rõ chạy toàn bộ trong 1 session (VD: để debug liên tục, cần giữ context xuyên suốt).</w:t>
+      </w:r>
+    </w:p>
+    <w:p>
+      <w:pPr>
+        <w:pStyle w:val="Heading4"/>
+      </w:pPr>
+      <w:r>
+        <w:rPr>
+          <w:color w:val="251C53"/>
+          <w:sz w:val="22"/>
+        </w:rPr>
+        <w:t>Khuyến nghị Strategic Compact (học từ `strategic-compact` skill của affaan-m/ecc)</w:t>
+      </w:r>
+    </w:p>
+    <w:p>
+      <w:pPr>
+        <w:spacing w:before="40" w:after="40"/>
+        <w:ind w:left="567"/>
+        <w:pBdr>
+          <w:left w:val="single" w:sz="12" w:space="10" w:color="F05922"/>
+        </w:pBdr>
+      </w:pPr>
+      <w:r>
+        <w:rPr>
+          <w:b/>
+          <w:color w:val="4A3F8C"/>
+        </w:rPr>
+        <w:t>Mục đích:</w:t>
+      </w:r>
+      <w:r>
+        <w:rPr>
+          <w:color w:val="4A3F8C"/>
+        </w:rPr>
+        <w:t xml:space="preserve"> Tránh auto-compact xảy ra giữa lúc đang thực hiện dở 1 bước nhiều-turn — mất chi tiết Handoff Log giữa việc sẽ khiến agent bước sau phải đọc lại từ đầu.</w:t>
+      </w:r>
+    </w:p>
+    <w:p>
+      <w:pPr>
+        <w:spacing w:after="80"/>
+      </w:pPr>
+      <w:r>
+        <w:rPr>
+          <w:b/>
+          <w:sz w:val="21"/>
+        </w:rPr>
+        <w:t>Quy tắc:</w:t>
+      </w:r>
+      <w:r>
+        <w:rPr>
+          <w:sz w:val="21"/>
+        </w:rPr>
+        <w:t xml:space="preserve"> Ngay sau khi 1 phase/bước trong plan vừa hoàn thành (logical boundary rõ ràng) VÀ context window đã dùng ≥ 50%, Dispatcher PHẢI chủ động gợi ý user:</w:t>
+      </w:r>
+    </w:p>
+    <w:p>
+      <w:pPr>
+        <w:spacing w:before="80" w:after="80"/>
+        <w:ind w:left="283"/>
+        <w:shd w:val="clear" w:color="auto" w:fill="F4F4F8"/>
+      </w:pPr>
+      <w:r>
+        <w:rPr>
+          <w:rFonts w:ascii="Courier New" w:hAnsi="Courier New"/>
+          <w:color w:val="251C53"/>
+          <w:sz w:val="18"/>
+        </w:rPr>
+        <w:t>Gợi ý: Phase [N] vừa hoàn thành — đây là điểm dừng tốt để compact context.</w:t>
+        <w:br/>
+        <w:t>Gõ /compact ngay bây giờ để giải phóng context window trước khi bắt đầu Phase [N+1].</w:t>
+        <w:br/>
+        <w:t>(Nếu bỏ qua, auto-compact có thể xảy ra giữa Phase [N+1] và làm mất Handoff Log.)</w:t>
+      </w:r>
+    </w:p>
+    <w:p>
+      <w:pPr>
+        <w:spacing w:after="80"/>
+      </w:pPr>
+      <w:r>
+        <w:rPr>
+          <w:b/>
+          <w:sz w:val="21"/>
+        </w:rPr>
+        <w:t>Thời điểm nên gợi ý compact (theo thứ tự ưu tiên):</w:t>
+      </w:r>
+    </w:p>
+    <w:p>
+      <w:pPr>
+        <w:spacing w:after="20"/>
+        <w:ind w:left="567" w:hanging="283"/>
+      </w:pPr>
+      <w:r>
+        <w:rPr>
+          <w:sz w:val="21"/>
+        </w:rPr>
+        <w:t>1.</w:t>
+        <w:tab/>
+      </w:r>
+      <w:r>
+        <w:rPr>
+          <w:sz w:val="21"/>
+        </w:rPr>
+        <w:t>Vừa xong toàn bộ 1 phase (Phase 0, Phase 1, Phase 2...)</w:t>
+      </w:r>
+    </w:p>
+    <w:p>
+      <w:pPr>
+        <w:spacing w:after="20"/>
+        <w:ind w:left="567" w:hanging="283"/>
+      </w:pPr>
+      <w:r>
+        <w:rPr>
+          <w:sz w:val="21"/>
+        </w:rPr>
+        <w:t>2.</w:t>
+        <w:tab/>
+      </w:r>
+      <w:r>
+        <w:rPr>
+          <w:sz w:val="21"/>
+        </w:rPr>
+        <w:t>Vừa xong 1 bước dài (nhiều tool calls, nhiều file được đọc/sửa)</w:t>
+      </w:r>
+    </w:p>
+    <w:p>
+      <w:pPr>
+        <w:spacing w:after="20"/>
+        <w:ind w:left="567" w:hanging="283"/>
+      </w:pPr>
+      <w:r>
+        <w:rPr>
+          <w:sz w:val="21"/>
+        </w:rPr>
+        <w:t>3.</w:t>
+        <w:tab/>
+      </w:r>
+      <w:r>
+        <w:rPr>
+          <w:sz w:val="21"/>
+        </w:rPr>
+        <w:t>Vừa commit+push xong — trạng thái git sạch, an toàn để reset context</w:t>
+      </w:r>
+    </w:p>
+    <w:p>
+      <w:pPr>
+        <w:spacing w:after="80"/>
+      </w:pPr>
+      <w:r>
+        <w:rPr>
+          <w:b/>
+          <w:sz w:val="21"/>
+        </w:rPr>
+        <w:t>KHÔNG gợi ý compact khi:</w:t>
+      </w:r>
+    </w:p>
+    <w:p>
+      <w:pPr>
+        <w:pStyle w:val="ListBullet"/>
+        <w:spacing w:after="20"/>
+        <w:ind w:left="283"/>
+      </w:pPr>
+      <w:r>
+        <w:rPr>
+          <w:sz w:val="21"/>
+        </w:rPr>
+        <w:t>Đang giữa bước (chưa commit, còn file đang sửa dở)</w:t>
+      </w:r>
+    </w:p>
+    <w:p>
+      <w:pPr>
+        <w:pStyle w:val="ListBullet"/>
+        <w:spacing w:after="20"/>
+        <w:ind w:left="283"/>
+      </w:pPr>
+      <w:r>
+        <w:rPr>
+          <w:sz w:val="21"/>
+        </w:rPr>
+        <w:t>Bước tiếp theo ngắn (ước tính ≤ 5 tool calls)</w:t>
+      </w:r>
+    </w:p>
+    <w:p>
+      <w:pPr>
+        <w:pStyle w:val="ListBullet"/>
+        <w:spacing w:after="20"/>
+        <w:ind w:left="283"/>
+      </w:pPr>
+      <w:r>
+        <w:rPr>
+          <w:sz w:val="21"/>
+        </w:rPr>
+        <w:t>User vừa mới chạy /compact trong vòng 2 bước vừa rồi</w:t>
       </w:r>
     </w:p>
     <w:p>
@@ -18365,6 +19515,100 @@
     </w:p>
     <w:p>
       <w:pPr>
+        <w:spacing w:before="40" w:after="40"/>
+        <w:ind w:left="567"/>
+        <w:pBdr>
+          <w:left w:val="single" w:sz="12" w:space="10" w:color="F05922"/>
+        </w:pBdr>
+      </w:pPr>
+      <w:r>
+        <w:rPr>
+          <w:b/>
+          <w:color w:val="4A3F8C"/>
+        </w:rPr>
+        <w:t>BẮT BUỘC — Eval-Driven Development (EDD, học từ affaan-m/ecc `eval-harness`):</w:t>
+      </w:r>
+    </w:p>
+    <w:p>
+      <w:pPr>
+        <w:spacing w:before="40" w:after="40"/>
+        <w:ind w:left="567"/>
+        <w:pBdr>
+          <w:left w:val="single" w:sz="12" w:space="10" w:color="F05922"/>
+        </w:pBdr>
+      </w:pPr>
+      <w:r>
+        <w:rPr>
+          <w:color w:val="4A3F8C"/>
+        </w:rPr>
+        <w:t xml:space="preserve">TRƯỚC khi tạo file định nghĩa agent/skill mới, PHẢI tạo file eval tương ứng tại </w:t>
+      </w:r>
+      <w:r>
+        <w:rPr>
+          <w:rFonts w:ascii="Courier New" w:hAnsi="Courier New"/>
+          <w:color w:val="F05922"/>
+          <w:sz w:val="18"/>
+        </w:rPr>
+        <w:t>.claude/evals/[name].md</w:t>
+      </w:r>
+      <w:r>
+        <w:rPr>
+          <w:color w:val="4A3F8C"/>
+        </w:rPr>
+        <w:t xml:space="preserve"> theo template </w:t>
+      </w:r>
+      <w:r>
+        <w:rPr>
+          <w:rFonts w:ascii="Courier New" w:hAnsi="Courier New"/>
+          <w:color w:val="F05922"/>
+          <w:sz w:val="18"/>
+        </w:rPr>
+        <w:t>.claude/templates/EVAL-template.md</w:t>
+      </w:r>
+      <w:r>
+        <w:rPr>
+          <w:color w:val="4A3F8C"/>
+        </w:rPr>
+        <w:t>. Sau khi implement, chạy thử các ví dụ trong eval và ghi kết quả pass/fail. Agent/skill chỉ được thêm vào routing table (CLAUDE.md §2) khi có ≥ 2/3 Capability Eval pass.</w:t>
+      </w:r>
+    </w:p>
+    <w:p>
+      <w:pPr>
+        <w:spacing w:after="80"/>
+      </w:pPr>
+      <w:r>
+        <w:rPr>
+          <w:b/>
+          <w:sz w:val="21"/>
+        </w:rPr>
+        <w:t>Thứ tự bắt buộc khi tạo agent/skill mới:</w:t>
+      </w:r>
+    </w:p>
+    <w:p>
+      <w:pPr>
+        <w:spacing w:before="80" w:after="80"/>
+        <w:ind w:left="283"/>
+        <w:shd w:val="clear" w:color="auto" w:fill="F4F4F8"/>
+      </w:pPr>
+      <w:r>
+        <w:rPr>
+          <w:rFonts w:ascii="Courier New" w:hAnsi="Courier New"/>
+          <w:color w:val="251C53"/>
+          <w:sz w:val="18"/>
+        </w:rPr>
+        <w:t>1. Tạo .claude/evals/[name].md từ EVAL-template.md — điền CE-01, CE-02, CE-03</w:t>
+        <w:br/>
+        <w:t>2. Tạo .claude/agents/[name].md hoặc .claude/commands/[name].md</w:t>
+        <w:br/>
+        <w:t>3. Chạy thử từng CE theo thứ tự, ghi kết quả vào bảng "Kết quả chạy thử"</w:t>
+        <w:br/>
+        <w:t>4. Nếu ≥ 2/3 CE pass → điền ≥ 1/2 RE pass → đánh dấu "APPROVED" → mới thêm vào routing</w:t>
+        <w:br/>
+        <w:t>5. Nếu CE fail → sửa lại định nghĩa agent → chạy lại eval</w:t>
+      </w:r>
+    </w:p>
+    <w:p>
+      <w:pPr>
         <w:spacing w:after="80"/>
       </w:pPr>
       <w:r>
@@ -18450,6 +19694,33 @@
           <w:sz w:val="21"/>
         </w:rPr>
         <w:t>Vị trí lưu:</w:t>
+      </w:r>
+    </w:p>
+    <w:p>
+      <w:pPr>
+        <w:pStyle w:val="ListBullet"/>
+        <w:spacing w:after="20"/>
+        <w:ind w:left="283"/>
+      </w:pPr>
+      <w:r>
+        <w:rPr>
+          <w:sz w:val="21"/>
+        </w:rPr>
+        <w:t xml:space="preserve">Eval: </w:t>
+      </w:r>
+      <w:r>
+        <w:rPr>
+          <w:rFonts w:ascii="Courier New" w:hAnsi="Courier New"/>
+          <w:color w:val="F05922"/>
+          <w:sz w:val="21"/>
+        </w:rPr>
+        <w:t>.claude/evals/[name].md</w:t>
+      </w:r>
+      <w:r>
+        <w:rPr>
+          <w:sz w:val="21"/>
+        </w:rPr>
+        <w:t xml:space="preserve"> (PHẢI tạo TRƯỚC)</w:t>
       </w:r>
     </w:p>
     <w:p>
@@ -20254,7 +21525,7 @@
               <w:rPr>
                 <w:sz w:val="20"/>
               </w:rPr>
-              <w:t>v1.1</w:t>
+              <w:t>v1.2</w:t>
             </w:r>
           </w:p>
         </w:tc>
@@ -20274,7 +21545,7 @@
               <w:rPr>
                 <w:sz w:val="20"/>
               </w:rPr>
-              <w:t xml:space="preserve">Áp dụng 8 đề xuất từ nghiên cứu revfactory/harness: P1 </w:t>
+              <w:t>Áp dụng 7 đề xuất E1-E7 từ nghiên cứu affaan-m/ecc: E1 hook bảo vệ config (</w:t>
             </w:r>
             <w:r>
               <w:rPr>
@@ -20282,13 +21553,13 @@
                 <w:color w:val="F05922"/>
                 <w:sz w:val="20"/>
               </w:rPr>
-              <w:t>_workspace/</w:t>
-            </w:r>
-            <w:r>
-              <w:rPr>
-                <w:sz w:val="20"/>
-              </w:rPr>
-              <w:t xml:space="preserve"> convention (§11.0), P2 Progressive Disclosure cho documentation-writer.md, P3 pushy description cho agents, P4 Phase 0 Audit trong WF-GITHUB-RESEARCH + WF-MIGRATE, P5 tạo skill </w:t>
+              <w:t>.claude/hooks/config-protection.js</w:t>
+            </w:r>
+            <w:r>
+              <w:rPr>
+                <w:sz w:val="20"/>
+              </w:rPr>
+              <w:t xml:space="preserve"> + </w:t>
             </w:r>
             <w:r>
               <w:rPr>
@@ -20296,13 +21567,13 @@
                 <w:color w:val="F05922"/>
                 <w:sz w:val="20"/>
               </w:rPr>
-              <w:t>skill-trigger-test</w:t>
-            </w:r>
-            <w:r>
-              <w:rPr>
-                <w:sz w:val="20"/>
-              </w:rPr>
-              <w:t xml:space="preserve">, P6 why-first cho quy tắc TUYỆT ĐỐI, P7 hướng dẫn fan-out </w:t>
+              <w:t>settings.json</w:t>
+            </w:r>
+            <w:r>
+              <w:rPr>
+                <w:sz w:val="20"/>
+              </w:rPr>
+              <w:t xml:space="preserve">), E2 GOTCHAS.md + yêu cầu đọc khi khởi động (§KHỞI ĐỘNG), E3 bảng DAILY/LIBRARY (CORE.md §6b), E4 skill </w:t>
             </w:r>
             <w:r>
               <w:rPr>
@@ -20310,13 +21581,13 @@
                 <w:color w:val="F05922"/>
                 <w:sz w:val="20"/>
               </w:rPr>
-              <w:t>run_in_background</w:t>
-            </w:r>
-            <w:r>
-              <w:rPr>
-                <w:sz w:val="20"/>
-              </w:rPr>
-              <w:t xml:space="preserve"> (§4), P8 Changelog (§21)</w:t>
+              <w:t>/verify-pr</w:t>
+            </w:r>
+            <w:r>
+              <w:rPr>
+                <w:sz w:val="20"/>
+              </w:rPr>
+              <w:t xml:space="preserve"> + yêu cầu trong WF-BUGFIX/WF-FEATURE, E5 EVAL-template.md + EDD requirement (§18.5), E6 Agent Introspection Debugging 4-phase (§9a), E7 Strategic Compact gợi ý (§16.5)</w:t>
             </w:r>
           </w:p>
         </w:tc>
@@ -20336,7 +21607,7 @@
               <w:rPr>
                 <w:sz w:val="20"/>
               </w:rPr>
-              <w:t xml:space="preserve">CLAUDE.md §4 §11 §21, </w:t>
+              <w:t xml:space="preserve">CLAUDE.md §KHỞI ĐỘNG §9a §16.5 §18.5 §WF-FEATURE §WF-BUGFIX §21; CORE.md §6b; </w:t>
             </w:r>
             <w:r>
               <w:rPr>
@@ -20344,13 +21615,13 @@
                 <w:color w:val="F05922"/>
                 <w:sz w:val="20"/>
               </w:rPr>
-              <w:t>.claude/agents/</w:t>
-            </w:r>
-            <w:r>
-              <w:rPr>
-                <w:sz w:val="20"/>
-              </w:rPr>
-              <w:t xml:space="preserve">, </w:t>
+              <w:t>.claude/hooks/</w:t>
+            </w:r>
+            <w:r>
+              <w:rPr>
+                <w:sz w:val="20"/>
+              </w:rPr>
+              <w:t xml:space="preserve">; </w:t>
             </w:r>
             <w:r>
               <w:rPr>
@@ -20360,6 +21631,20 @@
               </w:rPr>
               <w:t>.claude/commands/</w:t>
             </w:r>
+            <w:r>
+              <w:rPr>
+                <w:sz w:val="20"/>
+              </w:rPr>
+              <w:t xml:space="preserve">; </w:t>
+            </w:r>
+            <w:r>
+              <w:rPr>
+                <w:rFonts w:ascii="Courier New" w:hAnsi="Courier New"/>
+                <w:color w:val="F05922"/>
+                <w:sz w:val="20"/>
+              </w:rPr>
+              <w:t>.claude/templates/</w:t>
+            </w:r>
           </w:p>
         </w:tc>
         <w:tc>
@@ -20378,7 +21663,7 @@
               <w:rPr>
                 <w:sz w:val="20"/>
               </w:rPr>
-              <w:t xml:space="preserve">Cải thiện Dispatcher routing accuracy, giảm context window per session, tăng maintainability. Xem </w:t>
+              <w:t xml:space="preserve">Tăng safety (config protection), giảm lỗi lặp (GOTCHAS), tối ưu context window (compact/DAILY-LIBRARY), chuẩn hoá pre-PR (verify-pr), chuẩn hoá tạo agent (EDD). Xem </w:t>
             </w:r>
             <w:r>
               <w:rPr>
@@ -20386,7 +21671,7 @@
                 <w:color w:val="F05922"/>
                 <w:sz w:val="20"/>
               </w:rPr>
-              <w:t>docs/research/RESEARCH-harness-2026-07-12.md</w:t>
+              <w:t>docs/research/RESEARCH-ecc-2026-07-12.md</w:t>
             </w:r>
           </w:p>
         </w:tc>
@@ -20426,6 +21711,177 @@
               <w:rPr>
                 <w:sz w:val="20"/>
               </w:rPr>
+              <w:t>v1.1</w:t>
+            </w:r>
+          </w:p>
+        </w:tc>
+        <w:tc>
+          <w:tcPr>
+            <w:tcW w:type="dxa" w:w="1938"/>
+            <w:tcBorders>
+              <w:top w:val="single" w:sz="4" w:space="0" w:color="CBCBCB"/>
+              <w:left w:val="single" w:sz="4" w:space="0" w:color="CBCBCB"/>
+              <w:bottom w:val="single" w:sz="4" w:space="0" w:color="CBCBCB"/>
+              <w:right w:val="single" w:sz="4" w:space="0" w:color="CBCBCB"/>
+            </w:tcBorders>
+          </w:tcPr>
+          <w:p>
+            <w:r>
+              <w:rPr>
+                <w:sz w:val="20"/>
+              </w:rPr>
+              <w:t xml:space="preserve">Áp dụng 8 đề xuất từ nghiên cứu revfactory/harness: P1 </w:t>
+            </w:r>
+            <w:r>
+              <w:rPr>
+                <w:rFonts w:ascii="Courier New" w:hAnsi="Courier New"/>
+                <w:color w:val="F05922"/>
+                <w:sz w:val="20"/>
+              </w:rPr>
+              <w:t>_workspace/</w:t>
+            </w:r>
+            <w:r>
+              <w:rPr>
+                <w:sz w:val="20"/>
+              </w:rPr>
+              <w:t xml:space="preserve"> convention (§11.0), P2 Progressive Disclosure cho documentation-writer.md, P3 pushy description cho agents, P4 Phase 0 Audit trong WF-GITHUB-RESEARCH + WF-MIGRATE, P5 tạo skill </w:t>
+            </w:r>
+            <w:r>
+              <w:rPr>
+                <w:rFonts w:ascii="Courier New" w:hAnsi="Courier New"/>
+                <w:color w:val="F05922"/>
+                <w:sz w:val="20"/>
+              </w:rPr>
+              <w:t>skill-trigger-test</w:t>
+            </w:r>
+            <w:r>
+              <w:rPr>
+                <w:sz w:val="20"/>
+              </w:rPr>
+              <w:t xml:space="preserve">, P6 why-first cho quy tắc TUYỆT ĐỐI, P7 hướng dẫn fan-out </w:t>
+            </w:r>
+            <w:r>
+              <w:rPr>
+                <w:rFonts w:ascii="Courier New" w:hAnsi="Courier New"/>
+                <w:color w:val="F05922"/>
+                <w:sz w:val="20"/>
+              </w:rPr>
+              <w:t>run_in_background</w:t>
+            </w:r>
+            <w:r>
+              <w:rPr>
+                <w:sz w:val="20"/>
+              </w:rPr>
+              <w:t xml:space="preserve"> (§4), P8 Changelog (§21)</w:t>
+            </w:r>
+          </w:p>
+        </w:tc>
+        <w:tc>
+          <w:tcPr>
+            <w:tcW w:type="dxa" w:w="1938"/>
+            <w:tcBorders>
+              <w:top w:val="single" w:sz="4" w:space="0" w:color="CBCBCB"/>
+              <w:left w:val="single" w:sz="4" w:space="0" w:color="CBCBCB"/>
+              <w:bottom w:val="single" w:sz="4" w:space="0" w:color="CBCBCB"/>
+              <w:right w:val="single" w:sz="4" w:space="0" w:color="CBCBCB"/>
+            </w:tcBorders>
+          </w:tcPr>
+          <w:p>
+            <w:r>
+              <w:rPr>
+                <w:sz w:val="20"/>
+              </w:rPr>
+              <w:t xml:space="preserve">CLAUDE.md §4 §11 §21, </w:t>
+            </w:r>
+            <w:r>
+              <w:rPr>
+                <w:rFonts w:ascii="Courier New" w:hAnsi="Courier New"/>
+                <w:color w:val="F05922"/>
+                <w:sz w:val="20"/>
+              </w:rPr>
+              <w:t>.claude/agents/</w:t>
+            </w:r>
+            <w:r>
+              <w:rPr>
+                <w:sz w:val="20"/>
+              </w:rPr>
+              <w:t xml:space="preserve">, </w:t>
+            </w:r>
+            <w:r>
+              <w:rPr>
+                <w:rFonts w:ascii="Courier New" w:hAnsi="Courier New"/>
+                <w:color w:val="F05922"/>
+                <w:sz w:val="20"/>
+              </w:rPr>
+              <w:t>.claude/commands/</w:t>
+            </w:r>
+          </w:p>
+        </w:tc>
+        <w:tc>
+          <w:tcPr>
+            <w:tcW w:type="dxa" w:w="1938"/>
+            <w:tcBorders>
+              <w:top w:val="single" w:sz="4" w:space="0" w:color="CBCBCB"/>
+              <w:left w:val="single" w:sz="4" w:space="0" w:color="CBCBCB"/>
+              <w:bottom w:val="single" w:sz="4" w:space="0" w:color="CBCBCB"/>
+              <w:right w:val="single" w:sz="4" w:space="0" w:color="CBCBCB"/>
+            </w:tcBorders>
+          </w:tcPr>
+          <w:p>
+            <w:r>
+              <w:rPr>
+                <w:sz w:val="20"/>
+              </w:rPr>
+              <w:t xml:space="preserve">Cải thiện Dispatcher routing accuracy, giảm context window per session, tăng maintainability. Xem </w:t>
+            </w:r>
+            <w:r>
+              <w:rPr>
+                <w:rFonts w:ascii="Courier New" w:hAnsi="Courier New"/>
+                <w:color w:val="F05922"/>
+                <w:sz w:val="20"/>
+              </w:rPr>
+              <w:t>docs/research/RESEARCH-harness-2026-07-12.md</w:t>
+            </w:r>
+          </w:p>
+        </w:tc>
+      </w:tr>
+      <w:tr>
+        <w:tc>
+          <w:tcPr>
+            <w:tcW w:type="dxa" w:w="1938"/>
+            <w:shd w:val="clear" w:color="auto" w:fill="B8B3D6"/>
+            <w:tcBorders>
+              <w:top w:val="single" w:sz="4" w:space="0" w:color="CBCBCB"/>
+              <w:left w:val="single" w:sz="4" w:space="0" w:color="CBCBCB"/>
+              <w:bottom w:val="single" w:sz="4" w:space="0" w:color="CBCBCB"/>
+              <w:right w:val="single" w:sz="4" w:space="0" w:color="CBCBCB"/>
+            </w:tcBorders>
+          </w:tcPr>
+          <w:p>
+            <w:r>
+              <w:rPr>
+                <w:sz w:val="20"/>
+              </w:rPr>
+              <w:t>2026-07-12</w:t>
+            </w:r>
+          </w:p>
+        </w:tc>
+        <w:tc>
+          <w:tcPr>
+            <w:tcW w:type="dxa" w:w="1938"/>
+            <w:shd w:val="clear" w:color="auto" w:fill="B8B3D6"/>
+            <w:tcBorders>
+              <w:top w:val="single" w:sz="4" w:space="0" w:color="CBCBCB"/>
+              <w:left w:val="single" w:sz="4" w:space="0" w:color="CBCBCB"/>
+              <w:bottom w:val="single" w:sz="4" w:space="0" w:color="CBCBCB"/>
+              <w:right w:val="single" w:sz="4" w:space="0" w:color="CBCBCB"/>
+            </w:tcBorders>
+          </w:tcPr>
+          <w:p>
+            <w:r>
+              <w:rPr>
+                <w:sz w:val="20"/>
+              </w:rPr>
               <w:t>v1.0</w:t>
             </w:r>
           </w:p>
@@ -20433,6 +21889,7 @@
         <w:tc>
           <w:tcPr>
             <w:tcW w:type="dxa" w:w="1938"/>
+            <w:shd w:val="clear" w:color="auto" w:fill="B8B3D6"/>
             <w:tcBorders>
               <w:top w:val="single" w:sz="4" w:space="0" w:color="CBCBCB"/>
               <w:left w:val="single" w:sz="4" w:space="0" w:color="CBCBCB"/>
@@ -20452,6 +21909,7 @@
         <w:tc>
           <w:tcPr>
             <w:tcW w:type="dxa" w:w="1938"/>
+            <w:shd w:val="clear" w:color="auto" w:fill="B8B3D6"/>
             <w:tcBorders>
               <w:top w:val="single" w:sz="4" w:space="0" w:color="CBCBCB"/>
               <w:left w:val="single" w:sz="4" w:space="0" w:color="CBCBCB"/>
@@ -20471,6 +21929,7 @@
         <w:tc>
           <w:tcPr>
             <w:tcW w:type="dxa" w:w="1938"/>
+            <w:shd w:val="clear" w:color="auto" w:fill="B8B3D6"/>
             <w:tcBorders>
               <w:top w:val="single" w:sz="4" w:space="0" w:color="CBCBCB"/>
               <w:left w:val="single" w:sz="4" w:space="0" w:color="CBCBCB"/>

</xml_diff>

<commit_message>
[PLAN-optimize-framework] Bước 4.3: Áp dụng rút gọn CLAUDE.md (7 Accept + 1 Modify)
- P8: Rút gọn §0 trade-off blockquote (~1 dòng dài → 1 dòng ngắn)
- P4: Xóa code block pseudocode fan-out §4 P7, thêm tham chiếu WORKFLOW.md Ví dụ 9
- P2 (Modify): Xóa 3 bullets "Điều kiện bỏ qua" Bước 5/10a/10b trong WF-FEATURE, giữ Bước 9
- P3: Xóa "Ví dụ hành động nhỏ hợp lệ" + 3 bullets trong §9a Phase 3
- P1: Xóa toàn bộ §13.2 (trùng 100% với §13.1 + §13.1b)
- P6: Rút gọn §16.5 Bước 2b WEB về 2 điểm khác biệt cốt lõi
- P9: Xóa blockquote giải thích lý do Handoff Log trong §16.5 Bước 4
- P7: Gộp 3 bullets "KHÔNG gợi ý compact khi" thành 1 câu in-line
- §21: Thêm entry v1.3 changelog
- Tiết kiệm thực tế: 34 dòng (1437 → 1403)
- KHÔNG áp dụng P5 và P10 (Reject bởi Tech Lead)

Plan: .claude/plans/PLAN-optimize-framework-2026-07-12.md
</commit_message>
<xml_diff>
--- a/CLAUDE.docx
+++ b/CLAUDE.docx
@@ -452,27 +452,13 @@
           <w:b/>
           <w:color w:val="4A3F8C"/>
         </w:rPr>
-        <w:t>Ghi chú về trade-off của tầng Dispatcher (tham khảo từ nghiên cứu `addyosmani/agent-skills` — xem `docs/research/RESEARCH-agent-skills-2026-07-12.md`):</w:t>
+        <w:t>Ghi chú trade-off Dispatcher:</w:t>
       </w:r>
       <w:r>
         <w:rPr>
           <w:color w:val="4A3F8C"/>
         </w:rPr>
-        <w:t xml:space="preserve"> mô hình Dispatcher điều phối tuần tự qua nhiều agent là lựa chọn CÓ CHỦ ĐÍCH để ép buộc chain-of-command và Two-Eyes Principle — không phải mặc định miễn phí. Cái giá phải trả: mỗi bước thêm là 1 "paraphrasing hop" (agent trước tóm tắt lại cho agent sau) → tăng chi phí token và độ trễ so với việc 1 agent làm thẳng. Với workflow đã đủ điều kiện nhẹ (WF-FASTTRACK, WF-HOTFIX, hoặc dùng </w:t>
-      </w:r>
-      <w:r>
-        <w:rPr>
-          <w:rFonts w:ascii="Courier New" w:hAnsi="Courier New"/>
-          <w:color w:val="F05922"/>
-          <w:sz w:val="18"/>
-        </w:rPr>
-        <w:t>/ship</w:t>
-      </w:r>
-      <w:r>
-        <w:rPr>
-          <w:color w:val="4A3F8C"/>
-        </w:rPr>
-        <w:t xml:space="preserve"> §4 CLAUDE.md làm gate cuối) — chấp nhận đánh đổi ít bước hơn nhưng KHÔNG được bỏ qua các bước Two-Eyes bắt buộc (§8). Đây là ghi chú nhận thức, không phải lý do để tự ý rút gọn chain ngoài các điều kiện bỏ qua đã ghi rõ trong §4.</w:t>
+        <w:t xml:space="preserve"> Mỗi bước thêm là 1 "paraphrasing hop" tốn token — đây là đánh đổi CÓ CHỦ ĐÍCH để giữ Two-Eyes Principle và chain-of-command. Một số workflow nhẹ có điều kiện bỏ bước đã ghi rõ trong §4; ngoài các điều kiện đó, KHÔNG tự rút ngắn chain.</w:t>
       </w:r>
     </w:p>
     <w:p>
@@ -2749,116 +2735,21 @@
         <w:rPr>
           <w:color w:val="4A3F8C"/>
         </w:rPr>
-        <w:t>, sau đó gọi bước thứ hai ngay lập tức (không chờ kết quả bước 1). Cả hai chạy đồng thời; Dispatcher chờ cả hai hoàn thành rồi mới tổng hợp output.</w:t>
-      </w:r>
-    </w:p>
-    <w:p>
-      <w:pPr>
-        <w:spacing w:before="40" w:after="40"/>
-        <w:ind w:left="567"/>
-        <w:pBdr>
-          <w:left w:val="single" w:sz="12" w:space="10" w:color="F05922"/>
-        </w:pBdr>
-      </w:pPr>
+        <w:t xml:space="preserve">, sau đó gọi bước thứ hai ngay lập tức (không chờ kết quả bước 1). Cả hai chạy đồng thời; Dispatcher chờ cả hai hoàn thành rồi mới tổng hợp output. Ví dụ cụ thể: xem </w:t>
+      </w:r>
       <w:r>
         <w:rPr>
           <w:rFonts w:ascii="Courier New" w:hAnsi="Courier New"/>
           <w:color w:val="F05922"/>
           <w:sz w:val="18"/>
         </w:rPr>
-        <w:t>`</w:t>
-      </w:r>
-    </w:p>
-    <w:p>
-      <w:pPr>
-        <w:spacing w:before="40" w:after="40"/>
-        <w:ind w:left="567"/>
-        <w:pBdr>
-          <w:left w:val="single" w:sz="12" w:space="10" w:color="F05922"/>
-        </w:pBdr>
-      </w:pPr>
+        <w:t>WORKFLOW.md</w:t>
+      </w:r>
       <w:r>
         <w:rPr>
           <w:color w:val="4A3F8C"/>
         </w:rPr>
-        <w:t># Ví dụ fan-out Bước 10b ∥ Bước 11 (WF-FEATURE):</w:t>
-      </w:r>
-    </w:p>
-    <w:p>
-      <w:pPr>
-        <w:spacing w:before="40" w:after="40"/>
-        <w:ind w:left="567"/>
-        <w:pBdr>
-          <w:left w:val="single" w:sz="12" w:space="10" w:color="F05922"/>
-        </w:pBdr>
-      </w:pPr>
-      <w:r>
-        <w:rPr>
-          <w:color w:val="4A3F8C"/>
-        </w:rPr>
-        <w:t>Agent(ux-ui-reviewer, run_in_background=true, prompt="Kiểm tra UI sau merge...")</w:t>
-      </w:r>
-    </w:p>
-    <w:p>
-      <w:pPr>
-        <w:spacing w:before="40" w:after="40"/>
-        <w:ind w:left="567"/>
-        <w:pBdr>
-          <w:left w:val="single" w:sz="12" w:space="10" w:color="F05922"/>
-        </w:pBdr>
-      </w:pPr>
-      <w:r>
-        <w:rPr>
-          <w:color w:val="4A3F8C"/>
-        </w:rPr>
-        <w:t>Agent(qa-engineer, prompt="Thực thi test plan...")</w:t>
-      </w:r>
-    </w:p>
-    <w:p>
-      <w:pPr>
-        <w:spacing w:before="40" w:after="40"/>
-        <w:ind w:left="567"/>
-        <w:pBdr>
-          <w:left w:val="single" w:sz="12" w:space="10" w:color="F05922"/>
-        </w:pBdr>
-      </w:pPr>
-      <w:r>
-        <w:rPr>
-          <w:color w:val="4A3F8C"/>
-        </w:rPr>
-        <w:t># → Hai agent chạy song song; sau đó:</w:t>
-      </w:r>
-    </w:p>
-    <w:p>
-      <w:pPr>
-        <w:spacing w:before="40" w:after="40"/>
-        <w:ind w:left="567"/>
-        <w:pBdr>
-          <w:left w:val="single" w:sz="12" w:space="10" w:color="F05922"/>
-        </w:pBdr>
-      </w:pPr>
-      <w:r>
-        <w:rPr>
-          <w:color w:val="4A3F8C"/>
-        </w:rPr>
-        <w:t># Dispatcher đọc kết quả cả hai → tổng hợp → chuyển Bước 12 (QA Lead)</w:t>
-      </w:r>
-    </w:p>
-    <w:p>
-      <w:pPr>
-        <w:spacing w:before="40" w:after="40"/>
-        <w:ind w:left="567"/>
-        <w:pBdr>
-          <w:left w:val="single" w:sz="12" w:space="10" w:color="F05922"/>
-        </w:pBdr>
-      </w:pPr>
-      <w:r>
-        <w:rPr>
-          <w:rFonts w:ascii="Courier New" w:hAnsi="Courier New"/>
-          <w:color w:val="F05922"/>
-          <w:sz w:val="18"/>
-        </w:rPr>
-        <w:t>`</w:t>
+        <w:t xml:space="preserve"> Ví dụ 9.</w:t>
       </w:r>
     </w:p>
     <w:p>
@@ -2997,67 +2888,13 @@
           <w:b/>
           <w:sz w:val="21"/>
         </w:rPr>
-        <w:t>Điều kiện bỏ qua Bước 5 (CTO):</w:t>
+        <w:t>Điều kiện bỏ qua Bước 9 (Junior Dev):</w:t>
       </w:r>
       <w:r>
         <w:rPr>
           <w:sz w:val="21"/>
         </w:rPr>
-        <w:t xml:space="preserve"> Feature không liên quan đến kiến trúc lớn, bảo mật, hoặc quyết định chiến lược.</w:t>
-      </w:r>
-    </w:p>
-    <w:p>
-      <w:pPr>
-        <w:spacing w:after="80"/>
-      </w:pPr>
-      <w:r>
-        <w:rPr>
-          <w:b/>
-          <w:sz w:val="21"/>
-        </w:rPr>
-        <w:t>Điều kiện bỏ qua Bước 9 (Junior Dev):</w:t>
-      </w:r>
-      <w:r>
-        <w:rPr>
-          <w:sz w:val="21"/>
-        </w:rPr>
         <w:t xml:space="preserve"> Không có task phù hợp cấp Junior, hoặc deadline quá gấp.</w:t>
-      </w:r>
-    </w:p>
-    <w:p>
-      <w:pPr>
-        <w:spacing w:after="80"/>
-      </w:pPr>
-      <w:r>
-        <w:rPr>
-          <w:b/>
-          <w:sz w:val="21"/>
-        </w:rPr>
-        <w:t>Điều kiện bỏ qua Bước 10a (Security Audit):</w:t>
-      </w:r>
-      <w:r>
-        <w:rPr>
-          <w:sz w:val="21"/>
-        </w:rPr>
-        <w:t xml:space="preserve"> Feature không đụng auth/payment/DB schema/dữ liệu nhạy cảm.</w:t>
-      </w:r>
-    </w:p>
-    <w:p>
-      <w:pPr>
-        <w:spacing w:after="80"/>
-      </w:pPr>
-      <w:r>
-        <w:rPr>
-          <w:b/>
-          <w:sz w:val="21"/>
-        </w:rPr>
-        <w:t>Điều kiện bỏ qua Bước 10b (UX/UI Reviewer):</w:t>
-      </w:r>
-      <w:r>
-        <w:rPr>
-          <w:sz w:val="21"/>
-        </w:rPr>
-        <w:t xml:space="preserve"> Feature không đụng đến UI (chỉ backend/API/logic nội bộ).</w:t>
       </w:r>
     </w:p>
     <w:p>
@@ -7091,78 +6928,6 @@
           <w:sz w:val="21"/>
         </w:rPr>
         <w:t>Kiểm tra kết quả ngay sau 1 lần thử — nếu vẫn fail → chuyển Phase 4, KHÔNG retry thêm</w:t>
-      </w:r>
-    </w:p>
-    <w:p>
-      <w:pPr>
-        <w:spacing w:after="80"/>
-      </w:pPr>
-      <w:r>
-        <w:rPr>
-          <w:sz w:val="21"/>
-        </w:rPr>
-        <w:t>Ví dụ hành động nhỏ hợp lệ:</w:t>
-      </w:r>
-    </w:p>
-    <w:p>
-      <w:pPr>
-        <w:pStyle w:val="ListBullet"/>
-        <w:spacing w:after="20"/>
-        <w:ind w:left="283"/>
-      </w:pPr>
-      <w:r>
-        <w:rPr>
-          <w:sz w:val="21"/>
-        </w:rPr>
-        <w:t>Cài 1 package còn thiếu</w:t>
-      </w:r>
-    </w:p>
-    <w:p>
-      <w:pPr>
-        <w:pStyle w:val="ListBullet"/>
-        <w:spacing w:after="20"/>
-        <w:ind w:left="283"/>
-      </w:pPr>
-      <w:r>
-        <w:rPr>
-          <w:sz w:val="21"/>
-        </w:rPr>
-        <w:t xml:space="preserve">Kiểm tra lại path bằng </w:t>
-      </w:r>
-      <w:r>
-        <w:rPr>
-          <w:rFonts w:ascii="Courier New" w:hAnsi="Courier New"/>
-          <w:color w:val="F05922"/>
-          <w:sz w:val="21"/>
-        </w:rPr>
-        <w:t>ls</w:t>
-      </w:r>
-      <w:r>
-        <w:rPr>
-          <w:sz w:val="21"/>
-        </w:rPr>
-        <w:t xml:space="preserve"> / </w:t>
-      </w:r>
-      <w:r>
-        <w:rPr>
-          <w:rFonts w:ascii="Courier New" w:hAnsi="Courier New"/>
-          <w:color w:val="F05922"/>
-          <w:sz w:val="21"/>
-        </w:rPr>
-        <w:t>Glob</w:t>
-      </w:r>
-    </w:p>
-    <w:p>
-      <w:pPr>
-        <w:pStyle w:val="ListBullet"/>
-        <w:spacing w:after="20"/>
-        <w:ind w:left="283"/>
-      </w:pPr>
-      <w:r>
-        <w:rPr>
-          <w:sz w:val="21"/>
-        </w:rPr>
-        <w:t>Đọc lại file config để xác nhận giá trị thực tế</w:t>
       </w:r>
     </w:p>
     <w:p>
@@ -12762,93 +12527,6 @@
           <w:color w:val="4A3F8C"/>
           <w:sz w:val="24"/>
         </w:rPr>
-        <w:t>13.2 Nguyên tắc chọn model</w:t>
-      </w:r>
-    </w:p>
-    <w:p>
-      <w:pPr>
-        <w:spacing w:after="80"/>
-      </w:pPr>
-      <w:r>
-        <w:rPr>
-          <w:b/>
-          <w:sz w:val="21"/>
-        </w:rPr>
-        <w:t>Opus 4.7</w:t>
-      </w:r>
-      <w:r>
-        <w:rPr>
-          <w:sz w:val="21"/>
-        </w:rPr>
-        <w:t xml:space="preserve"> dùng cho CTO và Tech Lead (suy luận sâu, rủi ro cao). </w:t>
-      </w:r>
-      <w:r>
-        <w:rPr>
-          <w:b/>
-          <w:sz w:val="21"/>
-        </w:rPr>
-        <w:t>Sonnet 4.6</w:t>
-      </w:r>
-      <w:r>
-        <w:rPr>
-          <w:sz w:val="21"/>
-        </w:rPr>
-        <w:t xml:space="preserve"> dùng cho tất cả các agent còn lại (viết văn bản, phân tích vừa, code phức tạp). </w:t>
-      </w:r>
-      <w:r>
-        <w:rPr>
-          <w:b/>
-          <w:sz w:val="21"/>
-        </w:rPr>
-        <w:t>Haiku 4.5</w:t>
-      </w:r>
-      <w:r>
-        <w:rPr>
-          <w:sz w:val="21"/>
-        </w:rPr>
-        <w:t xml:space="preserve"> dùng cho task cơ học có template theo §13.1b — không thay thế model mặc định của agent, chỉ downshift từng task cụ thể.</w:t>
-      </w:r>
-    </w:p>
-    <w:p>
-      <w:pPr>
-        <w:spacing w:before="40" w:after="40"/>
-        <w:ind w:left="567"/>
-        <w:pBdr>
-          <w:left w:val="single" w:sz="12" w:space="10" w:color="F05922"/>
-        </w:pBdr>
-      </w:pPr>
-      <w:r>
-        <w:rPr>
-          <w:b/>
-          <w:color w:val="4A3F8C"/>
-        </w:rPr>
-        <w:t>Nguyên tắc turn count (quan trọng khi cân nhắc downshift):</w:t>
-      </w:r>
-      <w:r>
-        <w:rPr>
-          <w:color w:val="4A3F8C"/>
-        </w:rPr>
-        <w:t xml:space="preserve"> Đơn giá token thấp hơn không đồng nghĩa chi phí tổng thấp hơn. Haiku phù hợp cho task ≤2 turns rõ ràng; task phức tạp hơn dù có vẻ đơn giản sẽ mất nhiều turns với Haiku hơn Sonnet, làm tổng chi phí và thời gian cao hơn. Khi không chắc task sẽ mất bao nhiêu turns → mặc định dùng Sonnet.</w:t>
-      </w:r>
-    </w:p>
-    <w:p>
-      <w:pPr>
-        <w:pBdr>
-          <w:bottom w:val="single" w:sz="6" w:space="1" w:color="F05922"/>
-        </w:pBdr>
-        <w:spacing w:after="120"/>
-      </w:pPr>
-    </w:p>
-    <w:p>
-      <w:pPr>
-        <w:pStyle w:val="Heading3"/>
-        <w:spacing w:before="160" w:after="60"/>
-      </w:pPr>
-      <w:r>
-        <w:rPr>
-          <w:color w:val="4A3F8C"/>
-          <w:sz w:val="24"/>
-        </w:rPr>
         <w:t>13.3 Quy tắc override model (khi nào được phép đổi)</w:t>
       </w:r>
     </w:p>
@@ -16953,32 +16631,26 @@
         <w:rPr>
           <w:sz w:val="21"/>
         </w:rPr>
-        <w:t>Với mỗi bước ⬜/🔄 kế tiếp trong plan:</w:t>
-      </w:r>
-    </w:p>
-    <w:p>
-      <w:pPr>
-        <w:spacing w:after="20"/>
-        <w:ind w:left="567" w:hanging="283"/>
-      </w:pPr>
-      <w:r>
-        <w:rPr>
+        <w:t xml:space="preserve">Tương tự Bước 2a với 2 điều chỉnh: </w:t>
+      </w:r>
+      <w:r>
+        <w:rPr>
+          <w:b/>
           <w:sz w:val="21"/>
         </w:rPr>
-        <w:t>1.</w:t>
-        <w:tab/>
+        <w:t>(1)</w:t>
       </w:r>
       <w:r>
         <w:rPr>
           <w:sz w:val="21"/>
         </w:rPr>
-        <w:t xml:space="preserve">Gọi </w:t>
+        <w:t xml:space="preserve"> Dùng </w:t>
       </w:r>
       <w:r>
         <w:rPr>
           <w:rFonts w:ascii="Courier New" w:hAnsi="Courier New"/>
           <w:color w:val="F05922"/>
-          <w:sz w:val="21"/>
+          <w:sz w:val="18"/>
         </w:rPr>
         <w:t>RemoteTrigger</w:t>
       </w:r>
@@ -16992,7 +16664,7 @@
         <w:rPr>
           <w:rFonts w:ascii="Courier New" w:hAnsi="Courier New"/>
           <w:color w:val="F05922"/>
-          <w:sz w:val="21"/>
+          <w:sz w:val="18"/>
         </w:rPr>
         <w:t>create</w:t>
       </w:r>
@@ -17006,73 +16678,48 @@
         <w:rPr>
           <w:rFonts w:ascii="Courier New" w:hAnsi="Courier New"/>
           <w:color w:val="F05922"/>
+          <w:sz w:val="18"/>
+        </w:rPr>
+        <w:t>run</w:t>
+      </w:r>
+      <w:r>
+        <w:rPr>
           <w:sz w:val="21"/>
         </w:rPr>
-        <w:t>run</w:t>
-      </w:r>
-      <w:r>
-        <w:rPr>
-          <w:sz w:val="21"/>
-        </w:rPr>
-        <w:t xml:space="preserve"> (các lần sau) với </w:t>
+        <w:t xml:space="preserve"> (các lần sau) thay </w:t>
       </w:r>
       <w:r>
         <w:rPr>
           <w:rFonts w:ascii="Courier New" w:hAnsi="Courier New"/>
           <w:color w:val="F05922"/>
+          <w:sz w:val="18"/>
+        </w:rPr>
+        <w:t>Agent</w:t>
+      </w:r>
+      <w:r>
+        <w:rPr>
           <w:sz w:val="21"/>
         </w:rPr>
-        <w:t>body</w:t>
-      </w:r>
-      <w:r>
-        <w:rPr>
+        <w:t xml:space="preserve"> tool — trigger chạy như session Web độc lập (xuất hiện ở tab "Web"/"Routines"). Body chứa prompt tương đương yêu cầu tự commit + push + cập nhật plan như mục LOCAL. </w:t>
+      </w:r>
+      <w:r>
+        <w:rPr>
+          <w:b/>
           <w:sz w:val="21"/>
         </w:rPr>
-        <w:t xml:space="preserve"> chứa prompt tương đương: mô tả bước, đường dẫn plan file, artifact mong đợi, và yêu cầu tự commit + push + cập nhật plan giống mục LOCAL (a, b, c ở trên).</w:t>
-      </w:r>
-    </w:p>
-    <w:p>
-      <w:pPr>
-        <w:spacing w:after="20"/>
-        <w:ind w:left="567" w:hanging="283"/>
-      </w:pPr>
+        <w:t>(2)</w:t>
+      </w:r>
       <w:r>
         <w:rPr>
           <w:sz w:val="21"/>
         </w:rPr>
-        <w:t>2.</w:t>
-        <w:tab/>
-      </w:r>
-      <w:r>
-        <w:rPr>
-          <w:sz w:val="21"/>
-        </w:rPr>
-        <w:t>Trigger chạy như 1 session Web độc lập (xuất hiện ở tab "Web"/"Routines" trong danh sách session) — tách biệt hoàn toàn khỏi session chính.</w:t>
-      </w:r>
-    </w:p>
-    <w:p>
-      <w:pPr>
-        <w:spacing w:after="20"/>
-        <w:ind w:left="567" w:hanging="283"/>
-      </w:pPr>
-      <w:r>
-        <w:rPr>
-          <w:sz w:val="21"/>
-        </w:rPr>
-        <w:t>3.</w:t>
-        <w:tab/>
-      </w:r>
-      <w:r>
-        <w:rPr>
-          <w:sz w:val="21"/>
-        </w:rPr>
-        <w:t xml:space="preserve">Sau khi trigger chạy xong, </w:t>
+        <w:t xml:space="preserve"> Sau khi trigger xong, </w:t>
       </w:r>
       <w:r>
         <w:rPr>
           <w:rFonts w:ascii="Courier New" w:hAnsi="Courier New"/>
           <w:color w:val="F05922"/>
-          <w:sz w:val="21"/>
+          <w:sz w:val="18"/>
         </w:rPr>
         <w:t>task-planner</w:t>
       </w:r>
@@ -17086,15 +16733,15 @@
         <w:rPr>
           <w:rFonts w:ascii="Courier New" w:hAnsi="Courier New"/>
           <w:color w:val="F05922"/>
+          <w:sz w:val="18"/>
+        </w:rPr>
+        <w:t>Read</w:t>
+      </w:r>
+      <w:r>
+        <w:rPr>
           <w:sz w:val="21"/>
         </w:rPr>
-        <w:t>Read</w:t>
-      </w:r>
-      <w:r>
-        <w:rPr>
-          <w:sz w:val="21"/>
-        </w:rPr>
-        <w:t xml:space="preserve"> lại plan file (đã được trigger cập nhật) để xác nhận bước đã ✅ trước khi tiếp tục bước kế tiếp — KHÔNG tự đoán trạng thái khi chưa đọc lại file.</w:t>
+        <w:t xml:space="preserve"> lại plan file để xác nhận bước đã ✅ trước khi tiếp tục — trigger không trả kết quả trực tiếp, KHÔNG tự đoán trạng thái.</w:t>
       </w:r>
     </w:p>
     <w:p>
@@ -17146,6 +16793,297 @@
     </w:p>
     <w:p>
       <w:pPr>
+        <w:spacing w:after="20"/>
+        <w:ind w:left="567" w:hanging="283"/>
+      </w:pPr>
+      <w:r>
+        <w:rPr>
+          <w:sz w:val="21"/>
+        </w:rPr>
+        <w:t>1.</w:t>
+        <w:tab/>
+      </w:r>
+      <w:r>
+        <w:rPr>
+          <w:sz w:val="21"/>
+        </w:rPr>
+        <w:t xml:space="preserve">Ngay sau khi hoàn thành bước (cùng lúc với Bước 2a.c / 2b tương ứng), agent/trigger PHẢI </w:t>
+      </w:r>
+      <w:r>
+        <w:rPr>
+          <w:rFonts w:ascii="Courier New" w:hAnsi="Courier New"/>
+          <w:color w:val="F05922"/>
+          <w:sz w:val="21"/>
+        </w:rPr>
+        <w:t>Edit</w:t>
+      </w:r>
+      <w:r>
+        <w:rPr>
+          <w:sz w:val="21"/>
+        </w:rPr>
+        <w:t xml:space="preserve"> thêm 1 entry vào mục </w:t>
+      </w:r>
+      <w:r>
+        <w:rPr>
+          <w:b/>
+          <w:sz w:val="21"/>
+        </w:rPr>
+        <w:t>"## Handoff Log"</w:t>
+      </w:r>
+      <w:r>
+        <w:rPr>
+          <w:sz w:val="21"/>
+        </w:rPr>
+        <w:t xml:space="preserve"> của plan file (xem cấu trúc ở </w:t>
+      </w:r>
+      <w:r>
+        <w:rPr>
+          <w:rFonts w:ascii="Courier New" w:hAnsi="Courier New"/>
+          <w:color w:val="F05922"/>
+          <w:sz w:val="21"/>
+        </w:rPr>
+        <w:t>PLAN-template.md</w:t>
+      </w:r>
+      <w:r>
+        <w:rPr>
+          <w:sz w:val="21"/>
+        </w:rPr>
+        <w:t>), theo format:</w:t>
+      </w:r>
+    </w:p>
+    <w:p>
+      <w:pPr>
+        <w:spacing w:after="80"/>
+      </w:pPr>
+      <w:r>
+        <w:rPr>
+          <w:rFonts w:ascii="Courier New" w:hAnsi="Courier New"/>
+          <w:color w:val="F05922"/>
+          <w:sz w:val="18"/>
+        </w:rPr>
+        <w:t>`</w:t>
+      </w:r>
+    </w:p>
+    <w:p>
+      <w:pPr>
+        <w:spacing w:after="80"/>
+      </w:pPr>
+      <w:r>
+        <w:rPr>
+          <w:sz w:val="21"/>
+        </w:rPr>
+        <w:t>### Bước N.M — [tên bước ngắn]</w:t>
+      </w:r>
+    </w:p>
+    <w:p>
+      <w:pPr>
+        <w:pStyle w:val="ListBullet"/>
+        <w:spacing w:after="20"/>
+        <w:ind w:left="567"/>
+      </w:pPr>
+      <w:r>
+        <w:rPr>
+          <w:sz w:val="21"/>
+        </w:rPr>
+        <w:t>Đã làm: [tóm tắt 2-3 câu, KHÔNG chép lại toàn bộ log]</w:t>
+      </w:r>
+    </w:p>
+    <w:p>
+      <w:pPr>
+        <w:pStyle w:val="ListBullet"/>
+        <w:spacing w:after="20"/>
+        <w:ind w:left="567"/>
+      </w:pPr>
+      <w:r>
+        <w:rPr>
+          <w:sz w:val="21"/>
+        </w:rPr>
+        <w:t>File/module đã đọc hoặc đổi: [đường dẫn cụ thể]</w:t>
+      </w:r>
+    </w:p>
+    <w:p>
+      <w:pPr>
+        <w:pStyle w:val="ListBullet"/>
+        <w:spacing w:after="20"/>
+        <w:ind w:left="567"/>
+      </w:pPr>
+      <w:r>
+        <w:rPr>
+          <w:sz w:val="21"/>
+        </w:rPr>
+        <w:t>Quyết định quan trọng: [nếu có — vd: chọn cách A vì lý do X]</w:t>
+      </w:r>
+    </w:p>
+    <w:p>
+      <w:pPr>
+        <w:pStyle w:val="ListBullet"/>
+        <w:spacing w:after="20"/>
+        <w:ind w:left="567"/>
+      </w:pPr>
+      <w:r>
+        <w:rPr>
+          <w:sz w:val="21"/>
+        </w:rPr>
+        <w:t>Bước sau cần biết: [cảnh báo / gotcha / điều KHÔNG cần làm lại — nếu có, ghi rõ; nếu không có → "Không có"]</w:t>
+      </w:r>
+    </w:p>
+    <w:p>
+      <w:pPr>
+        <w:spacing w:after="80"/>
+      </w:pPr>
+      <w:r>
+        <w:rPr>
+          <w:rFonts w:ascii="Courier New" w:hAnsi="Courier New"/>
+          <w:color w:val="F05922"/>
+          <w:sz w:val="18"/>
+        </w:rPr>
+        <w:t>`</w:t>
+      </w:r>
+    </w:p>
+    <w:p>
+      <w:pPr>
+        <w:spacing w:after="20"/>
+        <w:ind w:left="567" w:hanging="283"/>
+      </w:pPr>
+      <w:r>
+        <w:rPr>
+          <w:sz w:val="21"/>
+        </w:rPr>
+        <w:t>2.</w:t>
+        <w:tab/>
+      </w:r>
+      <w:r>
+        <w:rPr>
+          <w:sz w:val="21"/>
+        </w:rPr>
+        <w:t xml:space="preserve">Trước khi giao bước kế tiếp cho subagent/trigger mới, </w:t>
+      </w:r>
+      <w:r>
+        <w:rPr>
+          <w:rFonts w:ascii="Courier New" w:hAnsi="Courier New"/>
+          <w:color w:val="F05922"/>
+          <w:sz w:val="21"/>
+        </w:rPr>
+        <w:t>task-planner</w:t>
+      </w:r>
+      <w:r>
+        <w:rPr>
+          <w:sz w:val="21"/>
+        </w:rPr>
+        <w:t xml:space="preserve">/Dispatcher PHẢI </w:t>
+      </w:r>
+      <w:r>
+        <w:rPr>
+          <w:rFonts w:ascii="Courier New" w:hAnsi="Courier New"/>
+          <w:color w:val="F05922"/>
+          <w:sz w:val="21"/>
+        </w:rPr>
+        <w:t>Read</w:t>
+      </w:r>
+      <w:r>
+        <w:rPr>
+          <w:sz w:val="21"/>
+        </w:rPr>
+        <w:t xml:space="preserve"> toàn bộ mục "Handoff Log" hiện có trong plan file, và </w:t>
+      </w:r>
+      <w:r>
+        <w:rPr>
+          <w:b/>
+          <w:sz w:val="21"/>
+        </w:rPr>
+        <w:t>nhúng nguyên văn nội dung đó vào đầu prompt</w:t>
+      </w:r>
+      <w:r>
+        <w:rPr>
+          <w:sz w:val="21"/>
+        </w:rPr>
+        <w:t xml:space="preserve"> của bước kế tiếp — coi như "bối cảnh đã biết", không để agent mới tự đọc lại toàn bộ codebase để suy ra lại những gì bước trước đã xác định.</w:t>
+      </w:r>
+    </w:p>
+    <w:p>
+      <w:pPr>
+        <w:spacing w:after="20"/>
+        <w:ind w:left="567" w:hanging="283"/>
+      </w:pPr>
+      <w:r>
+        <w:rPr>
+          <w:sz w:val="21"/>
+        </w:rPr>
+        <w:t>3.</w:t>
+        <w:tab/>
+      </w:r>
+      <w:r>
+        <w:rPr>
+          <w:sz w:val="21"/>
+        </w:rPr>
+        <w:t>Agent bước sau CHỈ đọc thêm file/code ngoài phạm vi Handoff Log đã cung cấp — không đọc lại phần đã được tóm tắt rõ.</w:t>
+      </w:r>
+    </w:p>
+    <w:p>
+      <w:pPr>
+        <w:pStyle w:val="Heading4"/>
+      </w:pPr>
+      <w:r>
+        <w:rPr>
+          <w:color w:val="251C53"/>
+          <w:sz w:val="22"/>
+        </w:rPr>
+        <w:t>Ngoại lệ — KHÔNG áp dụng session isolation khi:</w:t>
+      </w:r>
+    </w:p>
+    <w:p>
+      <w:pPr>
+        <w:pStyle w:val="ListBullet"/>
+        <w:spacing w:after="20"/>
+        <w:ind w:left="283"/>
+      </w:pPr>
+      <w:r>
+        <w:rPr>
+          <w:sz w:val="21"/>
+        </w:rPr>
+        <w:t>Plan chỉ có 1 bước duy nhất (không đáng tách session).</w:t>
+      </w:r>
+    </w:p>
+    <w:p>
+      <w:pPr>
+        <w:pStyle w:val="ListBullet"/>
+        <w:spacing w:after="20"/>
+        <w:ind w:left="283"/>
+      </w:pPr>
+      <w:r>
+        <w:rPr>
+          <w:sz w:val="21"/>
+        </w:rPr>
+        <w:t>Bước là câu hỏi/xác nhận với user, không phải bước thực thi.</w:t>
+      </w:r>
+    </w:p>
+    <w:p>
+      <w:pPr>
+        <w:pStyle w:val="ListBullet"/>
+        <w:spacing w:after="20"/>
+        <w:ind w:left="283"/>
+      </w:pPr>
+      <w:r>
+        <w:rPr>
+          <w:sz w:val="21"/>
+        </w:rPr>
+        <w:t>User yêu cầu rõ chạy toàn bộ trong 1 session (VD: để debug liên tục, cần giữ context xuyên suốt).</w:t>
+      </w:r>
+    </w:p>
+    <w:p>
+      <w:pPr>
+        <w:pStyle w:val="Heading4"/>
+      </w:pPr>
+      <w:r>
+        <w:rPr>
+          <w:color w:val="251C53"/>
+          <w:sz w:val="22"/>
+        </w:rPr>
+        <w:t>Khuyến nghị Strategic Compact (học từ `strategic-compact` skill của affaan-m/ecc)</w:t>
+      </w:r>
+    </w:p>
+    <w:p>
+      <w:pPr>
         <w:spacing w:before="40" w:after="40"/>
         <w:ind w:left="567"/>
         <w:pBdr>
@@ -17154,312 +17092,6 @@
       </w:pPr>
       <w:r>
         <w:rPr>
-          <w:color w:val="4A3F8C"/>
-        </w:rPr>
-        <w:t>Vì mỗi bước chạy trong subagent/trigger tách biệt (Bước 2a/2b), agent thực hiện bước N+1 KHÔNG thấy được lịch sử session của bước N. Nếu không ghi lại, bước sau sẽ phải tự đọc code, tự suy luận lại từ đầu — tốn thời gian và có thể suy luận SAI khác với bước trước.</w:t>
-      </w:r>
-    </w:p>
-    <w:p>
-      <w:pPr>
-        <w:spacing w:after="20"/>
-        <w:ind w:left="567" w:hanging="283"/>
-      </w:pPr>
-      <w:r>
-        <w:rPr>
-          <w:sz w:val="21"/>
-        </w:rPr>
-        <w:t>1.</w:t>
-        <w:tab/>
-      </w:r>
-      <w:r>
-        <w:rPr>
-          <w:sz w:val="21"/>
-        </w:rPr>
-        <w:t xml:space="preserve">Ngay sau khi hoàn thành bước (cùng lúc với Bước 2a.c / 2b tương ứng), agent/trigger PHẢI </w:t>
-      </w:r>
-      <w:r>
-        <w:rPr>
-          <w:rFonts w:ascii="Courier New" w:hAnsi="Courier New"/>
-          <w:color w:val="F05922"/>
-          <w:sz w:val="21"/>
-        </w:rPr>
-        <w:t>Edit</w:t>
-      </w:r>
-      <w:r>
-        <w:rPr>
-          <w:sz w:val="21"/>
-        </w:rPr>
-        <w:t xml:space="preserve"> thêm 1 entry vào mục </w:t>
-      </w:r>
-      <w:r>
-        <w:rPr>
-          <w:b/>
-          <w:sz w:val="21"/>
-        </w:rPr>
-        <w:t>"## Handoff Log"</w:t>
-      </w:r>
-      <w:r>
-        <w:rPr>
-          <w:sz w:val="21"/>
-        </w:rPr>
-        <w:t xml:space="preserve"> của plan file (xem cấu trúc ở </w:t>
-      </w:r>
-      <w:r>
-        <w:rPr>
-          <w:rFonts w:ascii="Courier New" w:hAnsi="Courier New"/>
-          <w:color w:val="F05922"/>
-          <w:sz w:val="21"/>
-        </w:rPr>
-        <w:t>PLAN-template.md</w:t>
-      </w:r>
-      <w:r>
-        <w:rPr>
-          <w:sz w:val="21"/>
-        </w:rPr>
-        <w:t>), theo format:</w:t>
-      </w:r>
-    </w:p>
-    <w:p>
-      <w:pPr>
-        <w:spacing w:after="80"/>
-      </w:pPr>
-      <w:r>
-        <w:rPr>
-          <w:rFonts w:ascii="Courier New" w:hAnsi="Courier New"/>
-          <w:color w:val="F05922"/>
-          <w:sz w:val="18"/>
-        </w:rPr>
-        <w:t>`</w:t>
-      </w:r>
-    </w:p>
-    <w:p>
-      <w:pPr>
-        <w:spacing w:after="80"/>
-      </w:pPr>
-      <w:r>
-        <w:rPr>
-          <w:sz w:val="21"/>
-        </w:rPr>
-        <w:t>### Bước N.M — [tên bước ngắn]</w:t>
-      </w:r>
-    </w:p>
-    <w:p>
-      <w:pPr>
-        <w:pStyle w:val="ListBullet"/>
-        <w:spacing w:after="20"/>
-        <w:ind w:left="567"/>
-      </w:pPr>
-      <w:r>
-        <w:rPr>
-          <w:sz w:val="21"/>
-        </w:rPr>
-        <w:t>Đã làm: [tóm tắt 2-3 câu, KHÔNG chép lại toàn bộ log]</w:t>
-      </w:r>
-    </w:p>
-    <w:p>
-      <w:pPr>
-        <w:pStyle w:val="ListBullet"/>
-        <w:spacing w:after="20"/>
-        <w:ind w:left="567"/>
-      </w:pPr>
-      <w:r>
-        <w:rPr>
-          <w:sz w:val="21"/>
-        </w:rPr>
-        <w:t>File/module đã đọc hoặc đổi: [đường dẫn cụ thể]</w:t>
-      </w:r>
-    </w:p>
-    <w:p>
-      <w:pPr>
-        <w:pStyle w:val="ListBullet"/>
-        <w:spacing w:after="20"/>
-        <w:ind w:left="567"/>
-      </w:pPr>
-      <w:r>
-        <w:rPr>
-          <w:sz w:val="21"/>
-        </w:rPr>
-        <w:t>Quyết định quan trọng: [nếu có — vd: chọn cách A vì lý do X]</w:t>
-      </w:r>
-    </w:p>
-    <w:p>
-      <w:pPr>
-        <w:pStyle w:val="ListBullet"/>
-        <w:spacing w:after="20"/>
-        <w:ind w:left="567"/>
-      </w:pPr>
-      <w:r>
-        <w:rPr>
-          <w:sz w:val="21"/>
-        </w:rPr>
-        <w:t>Bước sau cần biết: [cảnh báo / gotcha / điều KHÔNG cần làm lại — nếu có, ghi rõ; nếu không có → "Không có"]</w:t>
-      </w:r>
-    </w:p>
-    <w:p>
-      <w:pPr>
-        <w:spacing w:after="80"/>
-      </w:pPr>
-      <w:r>
-        <w:rPr>
-          <w:rFonts w:ascii="Courier New" w:hAnsi="Courier New"/>
-          <w:color w:val="F05922"/>
-          <w:sz w:val="18"/>
-        </w:rPr>
-        <w:t>`</w:t>
-      </w:r>
-    </w:p>
-    <w:p>
-      <w:pPr>
-        <w:spacing w:after="20"/>
-        <w:ind w:left="567" w:hanging="283"/>
-      </w:pPr>
-      <w:r>
-        <w:rPr>
-          <w:sz w:val="21"/>
-        </w:rPr>
-        <w:t>2.</w:t>
-        <w:tab/>
-      </w:r>
-      <w:r>
-        <w:rPr>
-          <w:sz w:val="21"/>
-        </w:rPr>
-        <w:t xml:space="preserve">Trước khi giao bước kế tiếp cho subagent/trigger mới, </w:t>
-      </w:r>
-      <w:r>
-        <w:rPr>
-          <w:rFonts w:ascii="Courier New" w:hAnsi="Courier New"/>
-          <w:color w:val="F05922"/>
-          <w:sz w:val="21"/>
-        </w:rPr>
-        <w:t>task-planner</w:t>
-      </w:r>
-      <w:r>
-        <w:rPr>
-          <w:sz w:val="21"/>
-        </w:rPr>
-        <w:t xml:space="preserve">/Dispatcher PHẢI </w:t>
-      </w:r>
-      <w:r>
-        <w:rPr>
-          <w:rFonts w:ascii="Courier New" w:hAnsi="Courier New"/>
-          <w:color w:val="F05922"/>
-          <w:sz w:val="21"/>
-        </w:rPr>
-        <w:t>Read</w:t>
-      </w:r>
-      <w:r>
-        <w:rPr>
-          <w:sz w:val="21"/>
-        </w:rPr>
-        <w:t xml:space="preserve"> toàn bộ mục "Handoff Log" hiện có trong plan file, và </w:t>
-      </w:r>
-      <w:r>
-        <w:rPr>
-          <w:b/>
-          <w:sz w:val="21"/>
-        </w:rPr>
-        <w:t>nhúng nguyên văn nội dung đó vào đầu prompt</w:t>
-      </w:r>
-      <w:r>
-        <w:rPr>
-          <w:sz w:val="21"/>
-        </w:rPr>
-        <w:t xml:space="preserve"> của bước kế tiếp — coi như "bối cảnh đã biết", không để agent mới tự đọc lại toàn bộ codebase để suy ra lại những gì bước trước đã xác định.</w:t>
-      </w:r>
-    </w:p>
-    <w:p>
-      <w:pPr>
-        <w:spacing w:after="20"/>
-        <w:ind w:left="567" w:hanging="283"/>
-      </w:pPr>
-      <w:r>
-        <w:rPr>
-          <w:sz w:val="21"/>
-        </w:rPr>
-        <w:t>3.</w:t>
-        <w:tab/>
-      </w:r>
-      <w:r>
-        <w:rPr>
-          <w:sz w:val="21"/>
-        </w:rPr>
-        <w:t>Agent bước sau CHỈ đọc thêm file/code ngoài phạm vi Handoff Log đã cung cấp — không đọc lại phần đã được tóm tắt rõ.</w:t>
-      </w:r>
-    </w:p>
-    <w:p>
-      <w:pPr>
-        <w:pStyle w:val="Heading4"/>
-      </w:pPr>
-      <w:r>
-        <w:rPr>
-          <w:color w:val="251C53"/>
-          <w:sz w:val="22"/>
-        </w:rPr>
-        <w:t>Ngoại lệ — KHÔNG áp dụng session isolation khi:</w:t>
-      </w:r>
-    </w:p>
-    <w:p>
-      <w:pPr>
-        <w:pStyle w:val="ListBullet"/>
-        <w:spacing w:after="20"/>
-        <w:ind w:left="283"/>
-      </w:pPr>
-      <w:r>
-        <w:rPr>
-          <w:sz w:val="21"/>
-        </w:rPr>
-        <w:t>Plan chỉ có 1 bước duy nhất (không đáng tách session).</w:t>
-      </w:r>
-    </w:p>
-    <w:p>
-      <w:pPr>
-        <w:pStyle w:val="ListBullet"/>
-        <w:spacing w:after="20"/>
-        <w:ind w:left="283"/>
-      </w:pPr>
-      <w:r>
-        <w:rPr>
-          <w:sz w:val="21"/>
-        </w:rPr>
-        <w:t>Bước là câu hỏi/xác nhận với user, không phải bước thực thi.</w:t>
-      </w:r>
-    </w:p>
-    <w:p>
-      <w:pPr>
-        <w:pStyle w:val="ListBullet"/>
-        <w:spacing w:after="20"/>
-        <w:ind w:left="283"/>
-      </w:pPr>
-      <w:r>
-        <w:rPr>
-          <w:sz w:val="21"/>
-        </w:rPr>
-        <w:t>User yêu cầu rõ chạy toàn bộ trong 1 session (VD: để debug liên tục, cần giữ context xuyên suốt).</w:t>
-      </w:r>
-    </w:p>
-    <w:p>
-      <w:pPr>
-        <w:pStyle w:val="Heading4"/>
-      </w:pPr>
-      <w:r>
-        <w:rPr>
-          <w:color w:val="251C53"/>
-          <w:sz w:val="22"/>
-        </w:rPr>
-        <w:t>Khuyến nghị Strategic Compact (học từ `strategic-compact` skill của affaan-m/ecc)</w:t>
-      </w:r>
-    </w:p>
-    <w:p>
-      <w:pPr>
-        <w:spacing w:before="40" w:after="40"/>
-        <w:ind w:left="567"/>
-        <w:pBdr>
-          <w:left w:val="single" w:sz="12" w:space="10" w:color="F05922"/>
-        </w:pBdr>
-      </w:pPr>
-      <w:r>
-        <w:rPr>
           <w:b/>
           <w:color w:val="4A3F8C"/>
         </w:rPr>
@@ -17589,44 +17221,11 @@
         </w:rPr>
         <w:t>KHÔNG gợi ý compact khi:</w:t>
       </w:r>
-    </w:p>
-    <w:p>
-      <w:pPr>
-        <w:pStyle w:val="ListBullet"/>
-        <w:spacing w:after="20"/>
-        <w:ind w:left="283"/>
-      </w:pPr>
       <w:r>
         <w:rPr>
           <w:sz w:val="21"/>
         </w:rPr>
-        <w:t>Đang giữa bước (chưa commit, còn file đang sửa dở)</w:t>
-      </w:r>
-    </w:p>
-    <w:p>
-      <w:pPr>
-        <w:pStyle w:val="ListBullet"/>
-        <w:spacing w:after="20"/>
-        <w:ind w:left="283"/>
-      </w:pPr>
-      <w:r>
-        <w:rPr>
-          <w:sz w:val="21"/>
-        </w:rPr>
-        <w:t>Bước tiếp theo ngắn (ước tính ≤ 5 tool calls)</w:t>
-      </w:r>
-    </w:p>
-    <w:p>
-      <w:pPr>
-        <w:pStyle w:val="ListBullet"/>
-        <w:spacing w:after="20"/>
-        <w:ind w:left="283"/>
-      </w:pPr>
-      <w:r>
-        <w:rPr>
-          <w:sz w:val="21"/>
-        </w:rPr>
-        <w:t>User vừa mới chạy /compact trong vòng 2 bước vừa rồi</w:t>
+        <w:t xml:space="preserve"> đang giữa bước (chưa commit), bước kế tiếp ước tính ≤ 5 tool calls, hoặc user vừa /compact trong 2 bước trước.</w:t>
       </w:r>
     </w:p>
     <w:p>
@@ -21525,7 +21124,7 @@
               <w:rPr>
                 <w:sz w:val="20"/>
               </w:rPr>
-              <w:t>v1.2</w:t>
+              <w:t>v1.3</w:t>
             </w:r>
           </w:p>
         </w:tc>
@@ -21545,7 +21144,7 @@
               <w:rPr>
                 <w:sz w:val="20"/>
               </w:rPr>
-              <w:t>Áp dụng 7 đề xuất E1-E7 từ nghiên cứu affaan-m/ecc: E1 hook bảo vệ config (</w:t>
+              <w:t xml:space="preserve">Rút gọn CLAUDE.md: xóa 7 đoạn overhead/trùng lặp (P1,P3,P4,P6,P7,P8,P9 + Modify P2), tiết kiệm 34 dòng thực tế — xem </w:t>
             </w:r>
             <w:r>
               <w:rPr>
@@ -21553,13 +21152,112 @@
                 <w:color w:val="F05922"/>
                 <w:sz w:val="20"/>
               </w:rPr>
-              <w:t>.claude/hooks/config-protection.js</w:t>
-            </w:r>
-            <w:r>
-              <w:rPr>
-                <w:sz w:val="20"/>
-              </w:rPr>
-              <w:t xml:space="preserve"> + </w:t>
+              <w:t>_workspace</w:t>
+            </w:r>
+            <w:r>
+              <w:rPr>
+                <w:sz w:val="20"/>
+              </w:rPr>
+              <w:t xml:space="preserve"> phân tích WF-REFACTOR optimize-framework</w:t>
+            </w:r>
+          </w:p>
+        </w:tc>
+        <w:tc>
+          <w:tcPr>
+            <w:tcW w:type="dxa" w:w="1938"/>
+            <w:shd w:val="clear" w:color="auto" w:fill="B8B3D6"/>
+            <w:tcBorders>
+              <w:top w:val="single" w:sz="4" w:space="0" w:color="CBCBCB"/>
+              <w:left w:val="single" w:sz="4" w:space="0" w:color="CBCBCB"/>
+              <w:bottom w:val="single" w:sz="4" w:space="0" w:color="CBCBCB"/>
+              <w:right w:val="single" w:sz="4" w:space="0" w:color="CBCBCB"/>
+            </w:tcBorders>
+          </w:tcPr>
+          <w:p>
+            <w:r>
+              <w:rPr>
+                <w:sz w:val="20"/>
+              </w:rPr>
+              <w:t>CLAUDE.md</w:t>
+            </w:r>
+          </w:p>
+        </w:tc>
+        <w:tc>
+          <w:tcPr>
+            <w:tcW w:type="dxa" w:w="1938"/>
+            <w:shd w:val="clear" w:color="auto" w:fill="B8B3D6"/>
+            <w:tcBorders>
+              <w:top w:val="single" w:sz="4" w:space="0" w:color="CBCBCB"/>
+              <w:left w:val="single" w:sz="4" w:space="0" w:color="CBCBCB"/>
+              <w:bottom w:val="single" w:sz="4" w:space="0" w:color="CBCBCB"/>
+              <w:right w:val="single" w:sz="4" w:space="0" w:color="CBCBCB"/>
+            </w:tcBorders>
+          </w:tcPr>
+          <w:p>
+            <w:r>
+              <w:rPr>
+                <w:sz w:val="20"/>
+              </w:rPr>
+              <w:t>Giảm overhead quy trình, loại bỏ nội dung trùng lặp giữa các §, không đổi nguyên tắc cứng nào</w:t>
+            </w:r>
+          </w:p>
+        </w:tc>
+      </w:tr>
+      <w:tr>
+        <w:tc>
+          <w:tcPr>
+            <w:tcW w:type="dxa" w:w="1938"/>
+            <w:tcBorders>
+              <w:top w:val="single" w:sz="4" w:space="0" w:color="CBCBCB"/>
+              <w:left w:val="single" w:sz="4" w:space="0" w:color="CBCBCB"/>
+              <w:bottom w:val="single" w:sz="4" w:space="0" w:color="CBCBCB"/>
+              <w:right w:val="single" w:sz="4" w:space="0" w:color="CBCBCB"/>
+            </w:tcBorders>
+          </w:tcPr>
+          <w:p>
+            <w:r>
+              <w:rPr>
+                <w:sz w:val="20"/>
+              </w:rPr>
+              <w:t>2026-07-12</w:t>
+            </w:r>
+          </w:p>
+        </w:tc>
+        <w:tc>
+          <w:tcPr>
+            <w:tcW w:type="dxa" w:w="1938"/>
+            <w:tcBorders>
+              <w:top w:val="single" w:sz="4" w:space="0" w:color="CBCBCB"/>
+              <w:left w:val="single" w:sz="4" w:space="0" w:color="CBCBCB"/>
+              <w:bottom w:val="single" w:sz="4" w:space="0" w:color="CBCBCB"/>
+              <w:right w:val="single" w:sz="4" w:space="0" w:color="CBCBCB"/>
+            </w:tcBorders>
+          </w:tcPr>
+          <w:p>
+            <w:r>
+              <w:rPr>
+                <w:sz w:val="20"/>
+              </w:rPr>
+              <w:t>v1.2</w:t>
+            </w:r>
+          </w:p>
+        </w:tc>
+        <w:tc>
+          <w:tcPr>
+            <w:tcW w:type="dxa" w:w="1938"/>
+            <w:tcBorders>
+              <w:top w:val="single" w:sz="4" w:space="0" w:color="CBCBCB"/>
+              <w:left w:val="single" w:sz="4" w:space="0" w:color="CBCBCB"/>
+              <w:bottom w:val="single" w:sz="4" w:space="0" w:color="CBCBCB"/>
+              <w:right w:val="single" w:sz="4" w:space="0" w:color="CBCBCB"/>
+            </w:tcBorders>
+          </w:tcPr>
+          <w:p>
+            <w:r>
+              <w:rPr>
+                <w:sz w:val="20"/>
+              </w:rPr>
+              <w:t>Áp dụng 7 đề xuất E1-E7 từ nghiên cứu affaan-m/ecc: E1 hook bảo vệ config (</w:t>
             </w:r>
             <w:r>
               <w:rPr>
@@ -21567,13 +21265,13 @@
                 <w:color w:val="F05922"/>
                 <w:sz w:val="20"/>
               </w:rPr>
-              <w:t>settings.json</w:t>
-            </w:r>
-            <w:r>
-              <w:rPr>
-                <w:sz w:val="20"/>
-              </w:rPr>
-              <w:t xml:space="preserve">), E2 GOTCHAS.md + yêu cầu đọc khi khởi động (§KHỞI ĐỘNG), E3 bảng DAILY/LIBRARY (CORE.md §6b), E4 skill </w:t>
+              <w:t>.claude/hooks/config-protection.js</w:t>
+            </w:r>
+            <w:r>
+              <w:rPr>
+                <w:sz w:val="20"/>
+              </w:rPr>
+              <w:t xml:space="preserve"> + </w:t>
             </w:r>
             <w:r>
               <w:rPr>
@@ -21581,6 +21279,20 @@
                 <w:color w:val="F05922"/>
                 <w:sz w:val="20"/>
               </w:rPr>
+              <w:t>settings.json</w:t>
+            </w:r>
+            <w:r>
+              <w:rPr>
+                <w:sz w:val="20"/>
+              </w:rPr>
+              <w:t xml:space="preserve">), E2 GOTCHAS.md + yêu cầu đọc khi khởi động (§KHỞI ĐỘNG), E3 bảng DAILY/LIBRARY (CORE.md §6b), E4 skill </w:t>
+            </w:r>
+            <w:r>
+              <w:rPr>
+                <w:rFonts w:ascii="Courier New" w:hAnsi="Courier New"/>
+                <w:color w:val="F05922"/>
+                <w:sz w:val="20"/>
+              </w:rPr>
               <w:t>/verify-pr</w:t>
             </w:r>
             <w:r>
@@ -21591,6 +21303,90 @@
             </w:r>
           </w:p>
         </w:tc>
+        <w:tc>
+          <w:tcPr>
+            <w:tcW w:type="dxa" w:w="1938"/>
+            <w:tcBorders>
+              <w:top w:val="single" w:sz="4" w:space="0" w:color="CBCBCB"/>
+              <w:left w:val="single" w:sz="4" w:space="0" w:color="CBCBCB"/>
+              <w:bottom w:val="single" w:sz="4" w:space="0" w:color="CBCBCB"/>
+              <w:right w:val="single" w:sz="4" w:space="0" w:color="CBCBCB"/>
+            </w:tcBorders>
+          </w:tcPr>
+          <w:p>
+            <w:r>
+              <w:rPr>
+                <w:sz w:val="20"/>
+              </w:rPr>
+              <w:t xml:space="preserve">CLAUDE.md §KHỞI ĐỘNG §9a §16.5 §18.5 §WF-FEATURE §WF-BUGFIX §21; CORE.md §6b; </w:t>
+            </w:r>
+            <w:r>
+              <w:rPr>
+                <w:rFonts w:ascii="Courier New" w:hAnsi="Courier New"/>
+                <w:color w:val="F05922"/>
+                <w:sz w:val="20"/>
+              </w:rPr>
+              <w:t>.claude/hooks/</w:t>
+            </w:r>
+            <w:r>
+              <w:rPr>
+                <w:sz w:val="20"/>
+              </w:rPr>
+              <w:t xml:space="preserve">; </w:t>
+            </w:r>
+            <w:r>
+              <w:rPr>
+                <w:rFonts w:ascii="Courier New" w:hAnsi="Courier New"/>
+                <w:color w:val="F05922"/>
+                <w:sz w:val="20"/>
+              </w:rPr>
+              <w:t>.claude/commands/</w:t>
+            </w:r>
+            <w:r>
+              <w:rPr>
+                <w:sz w:val="20"/>
+              </w:rPr>
+              <w:t xml:space="preserve">; </w:t>
+            </w:r>
+            <w:r>
+              <w:rPr>
+                <w:rFonts w:ascii="Courier New" w:hAnsi="Courier New"/>
+                <w:color w:val="F05922"/>
+                <w:sz w:val="20"/>
+              </w:rPr>
+              <w:t>.claude/templates/</w:t>
+            </w:r>
+          </w:p>
+        </w:tc>
+        <w:tc>
+          <w:tcPr>
+            <w:tcW w:type="dxa" w:w="1938"/>
+            <w:tcBorders>
+              <w:top w:val="single" w:sz="4" w:space="0" w:color="CBCBCB"/>
+              <w:left w:val="single" w:sz="4" w:space="0" w:color="CBCBCB"/>
+              <w:bottom w:val="single" w:sz="4" w:space="0" w:color="CBCBCB"/>
+              <w:right w:val="single" w:sz="4" w:space="0" w:color="CBCBCB"/>
+            </w:tcBorders>
+          </w:tcPr>
+          <w:p>
+            <w:r>
+              <w:rPr>
+                <w:sz w:val="20"/>
+              </w:rPr>
+              <w:t xml:space="preserve">Tăng safety (config protection), giảm lỗi lặp (GOTCHAS), tối ưu context window (compact/DAILY-LIBRARY), chuẩn hoá pre-PR (verify-pr), chuẩn hoá tạo agent (EDD). Xem </w:t>
+            </w:r>
+            <w:r>
+              <w:rPr>
+                <w:rFonts w:ascii="Courier New" w:hAnsi="Courier New"/>
+                <w:color w:val="F05922"/>
+                <w:sz w:val="20"/>
+              </w:rPr>
+              <w:t>docs/research/RESEARCH-ecc-2026-07-12.md</w:t>
+            </w:r>
+          </w:p>
+        </w:tc>
+      </w:tr>
+      <w:tr>
         <w:tc>
           <w:tcPr>
             <w:tcW w:type="dxa" w:w="1938"/>
@@ -21607,7 +21403,47 @@
               <w:rPr>
                 <w:sz w:val="20"/>
               </w:rPr>
-              <w:t xml:space="preserve">CLAUDE.md §KHỞI ĐỘNG §9a §16.5 §18.5 §WF-FEATURE §WF-BUGFIX §21; CORE.md §6b; </w:t>
+              <w:t>2026-07-12</w:t>
+            </w:r>
+          </w:p>
+        </w:tc>
+        <w:tc>
+          <w:tcPr>
+            <w:tcW w:type="dxa" w:w="1938"/>
+            <w:shd w:val="clear" w:color="auto" w:fill="B8B3D6"/>
+            <w:tcBorders>
+              <w:top w:val="single" w:sz="4" w:space="0" w:color="CBCBCB"/>
+              <w:left w:val="single" w:sz="4" w:space="0" w:color="CBCBCB"/>
+              <w:bottom w:val="single" w:sz="4" w:space="0" w:color="CBCBCB"/>
+              <w:right w:val="single" w:sz="4" w:space="0" w:color="CBCBCB"/>
+            </w:tcBorders>
+          </w:tcPr>
+          <w:p>
+            <w:r>
+              <w:rPr>
+                <w:sz w:val="20"/>
+              </w:rPr>
+              <w:t>v1.1</w:t>
+            </w:r>
+          </w:p>
+        </w:tc>
+        <w:tc>
+          <w:tcPr>
+            <w:tcW w:type="dxa" w:w="1938"/>
+            <w:shd w:val="clear" w:color="auto" w:fill="B8B3D6"/>
+            <w:tcBorders>
+              <w:top w:val="single" w:sz="4" w:space="0" w:color="CBCBCB"/>
+              <w:left w:val="single" w:sz="4" w:space="0" w:color="CBCBCB"/>
+              <w:bottom w:val="single" w:sz="4" w:space="0" w:color="CBCBCB"/>
+              <w:right w:val="single" w:sz="4" w:space="0" w:color="CBCBCB"/>
+            </w:tcBorders>
+          </w:tcPr>
+          <w:p>
+            <w:r>
+              <w:rPr>
+                <w:sz w:val="20"/>
+              </w:rPr>
+              <w:t xml:space="preserve">Áp dụng 8 đề xuất từ nghiên cứu revfactory/harness: P1 </w:t>
             </w:r>
             <w:r>
               <w:rPr>
@@ -21615,13 +21451,13 @@
                 <w:color w:val="F05922"/>
                 <w:sz w:val="20"/>
               </w:rPr>
-              <w:t>.claude/hooks/</w:t>
-            </w:r>
-            <w:r>
-              <w:rPr>
-                <w:sz w:val="20"/>
-              </w:rPr>
-              <w:t xml:space="preserve">; </w:t>
+              <w:t>_workspace/</w:t>
+            </w:r>
+            <w:r>
+              <w:rPr>
+                <w:sz w:val="20"/>
+              </w:rPr>
+              <w:t xml:space="preserve"> convention (§11.0), P2 Progressive Disclosure cho documentation-writer.md, P3 pushy description cho agents, P4 Phase 0 Audit trong WF-GITHUB-RESEARCH + WF-MIGRATE, P5 tạo skill </w:t>
             </w:r>
             <w:r>
               <w:rPr>
@@ -21629,13 +21465,13 @@
                 <w:color w:val="F05922"/>
                 <w:sz w:val="20"/>
               </w:rPr>
-              <w:t>.claude/commands/</w:t>
-            </w:r>
-            <w:r>
-              <w:rPr>
-                <w:sz w:val="20"/>
-              </w:rPr>
-              <w:t xml:space="preserve">; </w:t>
+              <w:t>skill-trigger-test</w:t>
+            </w:r>
+            <w:r>
+              <w:rPr>
+                <w:sz w:val="20"/>
+              </w:rPr>
+              <w:t xml:space="preserve">, P6 why-first cho quy tắc TUYỆT ĐỐI, P7 hướng dẫn fan-out </w:t>
             </w:r>
             <w:r>
               <w:rPr>
@@ -21643,7 +21479,13 @@
                 <w:color w:val="F05922"/>
                 <w:sz w:val="20"/>
               </w:rPr>
-              <w:t>.claude/templates/</w:t>
+              <w:t>run_in_background</w:t>
+            </w:r>
+            <w:r>
+              <w:rPr>
+                <w:sz w:val="20"/>
+              </w:rPr>
+              <w:t xml:space="preserve"> (§4), P8 Changelog (§21)</w:t>
             </w:r>
           </w:p>
         </w:tc>
@@ -21663,7 +21505,7 @@
               <w:rPr>
                 <w:sz w:val="20"/>
               </w:rPr>
-              <w:t xml:space="preserve">Tăng safety (config protection), giảm lỗi lặp (GOTCHAS), tối ưu context window (compact/DAILY-LIBRARY), chuẩn hoá pre-PR (verify-pr), chuẩn hoá tạo agent (EDD). Xem </w:t>
+              <w:t xml:space="preserve">CLAUDE.md §4 §11 §21, </w:t>
             </w:r>
             <w:r>
               <w:rPr>
@@ -21671,7 +21513,49 @@
                 <w:color w:val="F05922"/>
                 <w:sz w:val="20"/>
               </w:rPr>
-              <w:t>docs/research/RESEARCH-ecc-2026-07-12.md</w:t>
+              <w:t>.claude/agents/</w:t>
+            </w:r>
+            <w:r>
+              <w:rPr>
+                <w:sz w:val="20"/>
+              </w:rPr>
+              <w:t xml:space="preserve">, </w:t>
+            </w:r>
+            <w:r>
+              <w:rPr>
+                <w:rFonts w:ascii="Courier New" w:hAnsi="Courier New"/>
+                <w:color w:val="F05922"/>
+                <w:sz w:val="20"/>
+              </w:rPr>
+              <w:t>.claude/commands/</w:t>
+            </w:r>
+          </w:p>
+        </w:tc>
+        <w:tc>
+          <w:tcPr>
+            <w:tcW w:type="dxa" w:w="1938"/>
+            <w:shd w:val="clear" w:color="auto" w:fill="B8B3D6"/>
+            <w:tcBorders>
+              <w:top w:val="single" w:sz="4" w:space="0" w:color="CBCBCB"/>
+              <w:left w:val="single" w:sz="4" w:space="0" w:color="CBCBCB"/>
+              <w:bottom w:val="single" w:sz="4" w:space="0" w:color="CBCBCB"/>
+              <w:right w:val="single" w:sz="4" w:space="0" w:color="CBCBCB"/>
+            </w:tcBorders>
+          </w:tcPr>
+          <w:p>
+            <w:r>
+              <w:rPr>
+                <w:sz w:val="20"/>
+              </w:rPr>
+              <w:t xml:space="preserve">Cải thiện Dispatcher routing accuracy, giảm context window per session, tăng maintainability. Xem </w:t>
+            </w:r>
+            <w:r>
+              <w:rPr>
+                <w:rFonts w:ascii="Courier New" w:hAnsi="Courier New"/>
+                <w:color w:val="F05922"/>
+                <w:sz w:val="20"/>
+              </w:rPr>
+              <w:t>docs/research/RESEARCH-harness-2026-07-12.md</w:t>
             </w:r>
           </w:p>
         </w:tc>
@@ -21711,7 +21595,7 @@
               <w:rPr>
                 <w:sz w:val="20"/>
               </w:rPr>
-              <w:t>v1.1</w:t>
+              <w:t>v1.0</w:t>
             </w:r>
           </w:p>
         </w:tc>
@@ -21730,49 +21614,7 @@
               <w:rPr>
                 <w:sz w:val="20"/>
               </w:rPr>
-              <w:t xml:space="preserve">Áp dụng 8 đề xuất từ nghiên cứu revfactory/harness: P1 </w:t>
-            </w:r>
-            <w:r>
-              <w:rPr>
-                <w:rFonts w:ascii="Courier New" w:hAnsi="Courier New"/>
-                <w:color w:val="F05922"/>
-                <w:sz w:val="20"/>
-              </w:rPr>
-              <w:t>_workspace/</w:t>
-            </w:r>
-            <w:r>
-              <w:rPr>
-                <w:sz w:val="20"/>
-              </w:rPr>
-              <w:t xml:space="preserve"> convention (§11.0), P2 Progressive Disclosure cho documentation-writer.md, P3 pushy description cho agents, P4 Phase 0 Audit trong WF-GITHUB-RESEARCH + WF-MIGRATE, P5 tạo skill </w:t>
-            </w:r>
-            <w:r>
-              <w:rPr>
-                <w:rFonts w:ascii="Courier New" w:hAnsi="Courier New"/>
-                <w:color w:val="F05922"/>
-                <w:sz w:val="20"/>
-              </w:rPr>
-              <w:t>skill-trigger-test</w:t>
-            </w:r>
-            <w:r>
-              <w:rPr>
-                <w:sz w:val="20"/>
-              </w:rPr>
-              <w:t xml:space="preserve">, P6 why-first cho quy tắc TUYỆT ĐỐI, P7 hướng dẫn fan-out </w:t>
-            </w:r>
-            <w:r>
-              <w:rPr>
-                <w:rFonts w:ascii="Courier New" w:hAnsi="Courier New"/>
-                <w:color w:val="F05922"/>
-                <w:sz w:val="20"/>
-              </w:rPr>
-              <w:t>run_in_background</w:t>
-            </w:r>
-            <w:r>
-              <w:rPr>
-                <w:sz w:val="20"/>
-              </w:rPr>
-              <w:t xml:space="preserve"> (§4), P8 Changelog (§21)</w:t>
+              <w:t>Khởi tạo hệ thống agent KZTEK — 17 agents, 4 skills, routing table đầy đủ</w:t>
             </w:r>
           </w:p>
         </w:tc>
@@ -21791,145 +21633,13 @@
               <w:rPr>
                 <w:sz w:val="20"/>
               </w:rPr>
-              <w:t xml:space="preserve">CLAUDE.md §4 §11 §21, </w:t>
-            </w:r>
-            <w:r>
-              <w:rPr>
-                <w:rFonts w:ascii="Courier New" w:hAnsi="Courier New"/>
-                <w:color w:val="F05922"/>
-                <w:sz w:val="20"/>
-              </w:rPr>
-              <w:t>.claude/agents/</w:t>
-            </w:r>
-            <w:r>
-              <w:rPr>
-                <w:sz w:val="20"/>
-              </w:rPr>
-              <w:t xml:space="preserve">, </w:t>
-            </w:r>
-            <w:r>
-              <w:rPr>
-                <w:rFonts w:ascii="Courier New" w:hAnsi="Courier New"/>
-                <w:color w:val="F05922"/>
-                <w:sz w:val="20"/>
-              </w:rPr>
-              <w:t>.claude/commands/</w:t>
+              <w:t>Toàn bộ hệ thống</w:t>
             </w:r>
           </w:p>
         </w:tc>
         <w:tc>
           <w:tcPr>
             <w:tcW w:type="dxa" w:w="1938"/>
-            <w:tcBorders>
-              <w:top w:val="single" w:sz="4" w:space="0" w:color="CBCBCB"/>
-              <w:left w:val="single" w:sz="4" w:space="0" w:color="CBCBCB"/>
-              <w:bottom w:val="single" w:sz="4" w:space="0" w:color="CBCBCB"/>
-              <w:right w:val="single" w:sz="4" w:space="0" w:color="CBCBCB"/>
-            </w:tcBorders>
-          </w:tcPr>
-          <w:p>
-            <w:r>
-              <w:rPr>
-                <w:sz w:val="20"/>
-              </w:rPr>
-              <w:t xml:space="preserve">Cải thiện Dispatcher routing accuracy, giảm context window per session, tăng maintainability. Xem </w:t>
-            </w:r>
-            <w:r>
-              <w:rPr>
-                <w:rFonts w:ascii="Courier New" w:hAnsi="Courier New"/>
-                <w:color w:val="F05922"/>
-                <w:sz w:val="20"/>
-              </w:rPr>
-              <w:t>docs/research/RESEARCH-harness-2026-07-12.md</w:t>
-            </w:r>
-          </w:p>
-        </w:tc>
-      </w:tr>
-      <w:tr>
-        <w:tc>
-          <w:tcPr>
-            <w:tcW w:type="dxa" w:w="1938"/>
-            <w:shd w:val="clear" w:color="auto" w:fill="B8B3D6"/>
-            <w:tcBorders>
-              <w:top w:val="single" w:sz="4" w:space="0" w:color="CBCBCB"/>
-              <w:left w:val="single" w:sz="4" w:space="0" w:color="CBCBCB"/>
-              <w:bottom w:val="single" w:sz="4" w:space="0" w:color="CBCBCB"/>
-              <w:right w:val="single" w:sz="4" w:space="0" w:color="CBCBCB"/>
-            </w:tcBorders>
-          </w:tcPr>
-          <w:p>
-            <w:r>
-              <w:rPr>
-                <w:sz w:val="20"/>
-              </w:rPr>
-              <w:t>2026-07-12</w:t>
-            </w:r>
-          </w:p>
-        </w:tc>
-        <w:tc>
-          <w:tcPr>
-            <w:tcW w:type="dxa" w:w="1938"/>
-            <w:shd w:val="clear" w:color="auto" w:fill="B8B3D6"/>
-            <w:tcBorders>
-              <w:top w:val="single" w:sz="4" w:space="0" w:color="CBCBCB"/>
-              <w:left w:val="single" w:sz="4" w:space="0" w:color="CBCBCB"/>
-              <w:bottom w:val="single" w:sz="4" w:space="0" w:color="CBCBCB"/>
-              <w:right w:val="single" w:sz="4" w:space="0" w:color="CBCBCB"/>
-            </w:tcBorders>
-          </w:tcPr>
-          <w:p>
-            <w:r>
-              <w:rPr>
-                <w:sz w:val="20"/>
-              </w:rPr>
-              <w:t>v1.0</w:t>
-            </w:r>
-          </w:p>
-        </w:tc>
-        <w:tc>
-          <w:tcPr>
-            <w:tcW w:type="dxa" w:w="1938"/>
-            <w:shd w:val="clear" w:color="auto" w:fill="B8B3D6"/>
-            <w:tcBorders>
-              <w:top w:val="single" w:sz="4" w:space="0" w:color="CBCBCB"/>
-              <w:left w:val="single" w:sz="4" w:space="0" w:color="CBCBCB"/>
-              <w:bottom w:val="single" w:sz="4" w:space="0" w:color="CBCBCB"/>
-              <w:right w:val="single" w:sz="4" w:space="0" w:color="CBCBCB"/>
-            </w:tcBorders>
-          </w:tcPr>
-          <w:p>
-            <w:r>
-              <w:rPr>
-                <w:sz w:val="20"/>
-              </w:rPr>
-              <w:t>Khởi tạo hệ thống agent KZTEK — 17 agents, 4 skills, routing table đầy đủ</w:t>
-            </w:r>
-          </w:p>
-        </w:tc>
-        <w:tc>
-          <w:tcPr>
-            <w:tcW w:type="dxa" w:w="1938"/>
-            <w:shd w:val="clear" w:color="auto" w:fill="B8B3D6"/>
-            <w:tcBorders>
-              <w:top w:val="single" w:sz="4" w:space="0" w:color="CBCBCB"/>
-              <w:left w:val="single" w:sz="4" w:space="0" w:color="CBCBCB"/>
-              <w:bottom w:val="single" w:sz="4" w:space="0" w:color="CBCBCB"/>
-              <w:right w:val="single" w:sz="4" w:space="0" w:color="CBCBCB"/>
-            </w:tcBorders>
-          </w:tcPr>
-          <w:p>
-            <w:r>
-              <w:rPr>
-                <w:sz w:val="20"/>
-              </w:rPr>
-              <w:t>Toàn bộ hệ thống</w:t>
-            </w:r>
-          </w:p>
-        </w:tc>
-        <w:tc>
-          <w:tcPr>
-            <w:tcW w:type="dxa" w:w="1938"/>
-            <w:shd w:val="clear" w:color="auto" w:fill="B8B3D6"/>
             <w:tcBorders>
               <w:top w:val="single" w:sz="4" w:space="0" w:color="CBCBCB"/>
               <w:left w:val="single" w:sz="4" w:space="0" w:color="CBCBCB"/>

</xml_diff>